<commit_message>
Corregir paleta a los colores institucionales reales de Lions
El informe y la presentación usaban púrpura/dorado como aproximación
genérica de "colores de club social". Se reemplaza por los colores
oficiales de Lions Clubs International (azul #00338D y dorado
#FDB913), tomados del logo oficial que subió el usuario, ya que este
entorno no tiene acceso a internet para verificar el manual de marca.
Co-Authored-By: Claude Sonnet 5 <noreply@anthropic.com>
Claude-Session: https://claude.ai/code/session_01UWKZXqoHYVxY6r86dsip31
</commit_message>
<xml_diff>
--- a/informes/Informe_Complementario_Modelo_Arriendo_Club_Leones_Z144.docx
+++ b/informes/Informe_Complementario_Modelo_Arriendo_Club_Leones_Z144.docx
@@ -12,7 +12,7 @@
           <w:rFonts w:ascii="Calibri" w:cs="Calibri" w:eastAsia="Calibri" w:hAnsi="Calibri"/>
           <w:b/>
           <w:bCs/>
-          <w:color w:val="B8892B"/>
+          <w:color w:val="FDB913"/>
           <w:spacing w:val="20"/>
           <w:sz w:val="24"/>
           <w:szCs w:val="24"/>
@@ -45,7 +45,7 @@
           <w:rFonts w:ascii="Calibri" w:cs="Calibri" w:eastAsia="Calibri" w:hAnsi="Calibri"/>
           <w:b/>
           <w:bCs/>
-          <w:color w:val="331153"/>
+          <w:color w:val="001F54"/>
           <w:sz w:val="56"/>
           <w:szCs w:val="56"/>
         </w:rPr>
@@ -62,7 +62,7 @@
           <w:rFonts w:ascii="Calibri" w:cs="Calibri" w:eastAsia="Calibri" w:hAnsi="Calibri"/>
           <w:b/>
           <w:bCs/>
-          <w:color w:val="4B1F6F"/>
+          <w:color w:val="00338D"/>
           <w:sz w:val="40"/>
           <w:szCs w:val="40"/>
         </w:rPr>
@@ -131,7 +131,7 @@
                 <w:rFonts w:ascii="Calibri" w:cs="Calibri" w:eastAsia="Calibri" w:hAnsi="Calibri"/>
                 <w:b/>
                 <w:bCs/>
-                <w:color w:val="4B1F6F"/>
+                <w:color w:val="00338D"/>
                 <w:sz w:val="19"/>
                 <w:szCs w:val="19"/>
               </w:rPr>
@@ -193,7 +193,7 @@
                 <w:rFonts w:ascii="Calibri" w:cs="Calibri" w:eastAsia="Calibri" w:hAnsi="Calibri"/>
                 <w:b/>
                 <w:bCs/>
-                <w:color w:val="4B1F6F"/>
+                <w:color w:val="00338D"/>
                 <w:sz w:val="19"/>
                 <w:szCs w:val="19"/>
               </w:rPr>
@@ -255,7 +255,7 @@
                 <w:rFonts w:ascii="Calibri" w:cs="Calibri" w:eastAsia="Calibri" w:hAnsi="Calibri"/>
                 <w:b/>
                 <w:bCs/>
-                <w:color w:val="4B1F6F"/>
+                <w:color w:val="00338D"/>
                 <w:sz w:val="19"/>
                 <w:szCs w:val="19"/>
               </w:rPr>
@@ -317,7 +317,7 @@
                 <w:rFonts w:ascii="Calibri" w:cs="Calibri" w:eastAsia="Calibri" w:hAnsi="Calibri"/>
                 <w:b/>
                 <w:bCs/>
-                <w:color w:val="4B1F6F"/>
+                <w:color w:val="00338D"/>
                 <w:sz w:val="19"/>
                 <w:szCs w:val="19"/>
               </w:rPr>
@@ -365,7 +365,7 @@
       <w:pPr>
         <w:pStyle w:val="Heading1"/>
         <w:pBdr>
-          <w:bottom w:val="single" w:color="B8892B" w:sz="8" w:space="6"/>
+          <w:bottom w:val="single" w:color="FDB913" w:sz="8" w:space="6"/>
         </w:pBdr>
         <w:spacing w:after="200"/>
       </w:pPr>
@@ -374,7 +374,7 @@
           <w:rFonts w:ascii="Calibri" w:cs="Calibri" w:eastAsia="Calibri" w:hAnsi="Calibri"/>
           <w:b/>
           <w:bCs/>
-          <w:color w:val="331153"/>
+          <w:color w:val="001F54"/>
           <w:sz w:val="30"/>
           <w:szCs w:val="30"/>
         </w:rPr>
@@ -428,7 +428,7 @@
               <w:bottom w:val="none" w:color="FFFFFF" w:sz="0"/>
               <w:right w:val="single" w:color="FFFFFF" w:sz="4"/>
             </w:tcBorders>
-            <w:shd w:fill="F1ECF6" w:color="auto" w:val="clear"/>
+            <w:shd w:fill="E9F0FA" w:color="auto" w:val="clear"/>
             <w:tcMar>
               <w:top w:type="dxa" w:w="160"/>
               <w:left w:type="dxa" w:w="100"/>
@@ -446,7 +446,7 @@
                 <w:rFonts w:ascii="Calibri" w:cs="Calibri" w:eastAsia="Calibri" w:hAnsi="Calibri"/>
                 <w:b/>
                 <w:bCs/>
-                <w:color w:val="331153"/>
+                <w:color w:val="001F54"/>
                 <w:sz w:val="28"/>
                 <w:szCs w:val="28"/>
               </w:rPr>
@@ -477,7 +477,7 @@
               <w:bottom w:val="none" w:color="FFFFFF" w:sz="0"/>
               <w:right w:val="single" w:color="FFFFFF" w:sz="4"/>
             </w:tcBorders>
-            <w:shd w:fill="F1ECF6" w:color="auto" w:val="clear"/>
+            <w:shd w:fill="E9F0FA" w:color="auto" w:val="clear"/>
             <w:tcMar>
               <w:top w:type="dxa" w:w="160"/>
               <w:left w:type="dxa" w:w="100"/>
@@ -495,7 +495,7 @@
                 <w:rFonts w:ascii="Calibri" w:cs="Calibri" w:eastAsia="Calibri" w:hAnsi="Calibri"/>
                 <w:b/>
                 <w:bCs/>
-                <w:color w:val="331153"/>
+                <w:color w:val="001F54"/>
                 <w:sz w:val="28"/>
                 <w:szCs w:val="28"/>
               </w:rPr>
@@ -526,7 +526,7 @@
               <w:bottom w:val="none" w:color="FFFFFF" w:sz="0"/>
               <w:right w:val="single" w:color="FFFFFF" w:sz="4"/>
             </w:tcBorders>
-            <w:shd w:fill="F1ECF6" w:color="auto" w:val="clear"/>
+            <w:shd w:fill="E9F0FA" w:color="auto" w:val="clear"/>
             <w:tcMar>
               <w:top w:type="dxa" w:w="160"/>
               <w:left w:type="dxa" w:w="100"/>
@@ -544,7 +544,7 @@
                 <w:rFonts w:ascii="Calibri" w:cs="Calibri" w:eastAsia="Calibri" w:hAnsi="Calibri"/>
                 <w:b/>
                 <w:bCs/>
-                <w:color w:val="331153"/>
+                <w:color w:val="001F54"/>
                 <w:sz w:val="28"/>
                 <w:szCs w:val="28"/>
               </w:rPr>
@@ -575,7 +575,7 @@
               <w:bottom w:val="none" w:color="FFFFFF" w:sz="0"/>
               <w:right w:val="single" w:color="FFFFFF" w:sz="4"/>
             </w:tcBorders>
-            <w:shd w:fill="F1ECF6" w:color="auto" w:val="clear"/>
+            <w:shd w:fill="E9F0FA" w:color="auto" w:val="clear"/>
             <w:tcMar>
               <w:top w:type="dxa" w:w="160"/>
               <w:left w:type="dxa" w:w="100"/>
@@ -593,7 +593,7 @@
                 <w:rFonts w:ascii="Calibri" w:cs="Calibri" w:eastAsia="Calibri" w:hAnsi="Calibri"/>
                 <w:b/>
                 <w:bCs/>
-                <w:color w:val="331153"/>
+                <w:color w:val="001F54"/>
                 <w:sz w:val="28"/>
                 <w:szCs w:val="28"/>
               </w:rPr>
@@ -646,11 +646,11 @@
             <w:tcW w:type="pct" w:w="100%"/>
             <w:tcBorders>
               <w:top w:val="single" w:color="D9D3E3" w:sz="4"/>
-              <w:left w:val="single" w:color="4B1F6F" w:sz="24"/>
-              <w:bottom w:val="single" w:color="D9D3E3" w:sz="4"/>
-              <w:right w:val="single" w:color="D9D3E3" w:sz="4"/>
-            </w:tcBorders>
-            <w:shd w:fill="F1ECF6" w:color="auto" w:val="clear"/>
+              <w:left w:val="single" w:color="00338D" w:sz="24"/>
+              <w:bottom w:val="single" w:color="D9D3E3" w:sz="4"/>
+              <w:right w:val="single" w:color="D9D3E3" w:sz="4"/>
+            </w:tcBorders>
+            <w:shd w:fill="E9F0FA" w:color="auto" w:val="clear"/>
             <w:tcMar>
               <w:top w:type="dxa" w:w="160"/>
               <w:left w:type="dxa" w:w="220"/>
@@ -667,7 +667,7 @@
                 <w:rFonts w:ascii="Calibri" w:cs="Calibri" w:eastAsia="Calibri" w:hAnsi="Calibri"/>
                 <w:b/>
                 <w:bCs/>
-                <w:color w:val="4B1F6F"/>
+                <w:color w:val="00338D"/>
                 <w:sz w:val="20"/>
                 <w:szCs w:val="20"/>
               </w:rPr>
@@ -707,7 +707,7 @@
           <w:rFonts w:ascii="Calibri" w:cs="Calibri" w:eastAsia="Calibri" w:hAnsi="Calibri"/>
           <w:b/>
           <w:bCs/>
-          <w:color w:val="4B1F6F"/>
+          <w:color w:val="00338D"/>
           <w:sz w:val="24"/>
           <w:szCs w:val="24"/>
         </w:rPr>
@@ -825,7 +825,7 @@
           <w:rFonts w:ascii="Calibri" w:cs="Calibri" w:eastAsia="Calibri" w:hAnsi="Calibri"/>
           <w:b/>
           <w:bCs/>
-          <w:color w:val="4B1F6F"/>
+          <w:color w:val="00338D"/>
           <w:sz w:val="24"/>
           <w:szCs w:val="24"/>
         </w:rPr>
@@ -856,7 +856,7 @@
         <w:pStyle w:val="Heading1"/>
         <w:keepNext/>
         <w:pBdr>
-          <w:bottom w:val="single" w:color="B8892B" w:sz="8" w:space="6"/>
+          <w:bottom w:val="single" w:color="FDB913" w:sz="8" w:space="6"/>
         </w:pBdr>
         <w:spacing w:after="200" w:before="480"/>
       </w:pPr>
@@ -865,7 +865,7 @@
           <w:rFonts w:ascii="Calibri" w:cs="Calibri" w:eastAsia="Calibri" w:hAnsi="Calibri"/>
           <w:b/>
           <w:bCs/>
-          <w:color w:val="B8892B"/>
+          <w:color w:val="FDB913"/>
           <w:sz w:val="30"/>
           <w:szCs w:val="30"/>
         </w:rPr>
@@ -876,7 +876,7 @@
           <w:rFonts w:ascii="Calibri" w:cs="Calibri" w:eastAsia="Calibri" w:hAnsi="Calibri"/>
           <w:b/>
           <w:bCs/>
-          <w:color w:val="331153"/>
+          <w:color w:val="001F54"/>
           <w:sz w:val="30"/>
           <w:szCs w:val="30"/>
         </w:rPr>
@@ -894,7 +894,7 @@
           <w:rFonts w:ascii="Calibri" w:cs="Calibri" w:eastAsia="Calibri" w:hAnsi="Calibri"/>
           <w:b/>
           <w:bCs/>
-          <w:color w:val="4B1F6F"/>
+          <w:color w:val="00338D"/>
           <w:sz w:val="24"/>
           <w:szCs w:val="24"/>
         </w:rPr>
@@ -926,7 +926,7 @@
           <w:rFonts w:ascii="Calibri" w:cs="Calibri" w:eastAsia="Calibri" w:hAnsi="Calibri"/>
           <w:b/>
           <w:bCs/>
-          <w:color w:val="4B1F6F"/>
+          <w:color w:val="00338D"/>
           <w:sz w:val="24"/>
           <w:szCs w:val="24"/>
         </w:rPr>
@@ -983,7 +983,7 @@
               <w:bottom w:val="single" w:color="D9D3E3" w:sz="4"/>
               <w:right w:val="single" w:color="D9D3E3" w:sz="4"/>
             </w:tcBorders>
-            <w:shd w:fill="4B1F6F" w:color="auto" w:val="clear"/>
+            <w:shd w:fill="00338D" w:color="auto" w:val="clear"/>
             <w:tcMar>
               <w:top w:type="dxa" w:w="90"/>
               <w:left w:type="dxa" w:w="120"/>
@@ -1018,7 +1018,7 @@
               <w:bottom w:val="single" w:color="D9D3E3" w:sz="4"/>
               <w:right w:val="single" w:color="D9D3E3" w:sz="4"/>
             </w:tcBorders>
-            <w:shd w:fill="4B1F6F" w:color="auto" w:val="clear"/>
+            <w:shd w:fill="00338D" w:color="auto" w:val="clear"/>
             <w:tcMar>
               <w:top w:type="dxa" w:w="90"/>
               <w:left w:type="dxa" w:w="120"/>
@@ -1053,7 +1053,7 @@
               <w:bottom w:val="single" w:color="D9D3E3" w:sz="4"/>
               <w:right w:val="single" w:color="D9D3E3" w:sz="4"/>
             </w:tcBorders>
-            <w:shd w:fill="4B1F6F" w:color="auto" w:val="clear"/>
+            <w:shd w:fill="00338D" w:color="auto" w:val="clear"/>
             <w:tcMar>
               <w:top w:type="dxa" w:w="90"/>
               <w:left w:type="dxa" w:w="120"/>
@@ -1197,7 +1197,7 @@
               <w:bottom w:val="single" w:color="D9D3E3" w:sz="4"/>
               <w:right w:val="single" w:color="D9D3E3" w:sz="4"/>
             </w:tcBorders>
-            <w:shd w:fill="F1ECF6" w:color="auto" w:val="clear"/>
+            <w:shd w:fill="E9F0FA" w:color="auto" w:val="clear"/>
             <w:tcMar>
               <w:top w:type="dxa" w:w="80"/>
               <w:left w:type="dxa" w:w="120"/>
@@ -1230,7 +1230,7 @@
               <w:bottom w:val="single" w:color="D9D3E3" w:sz="4"/>
               <w:right w:val="single" w:color="D9D3E3" w:sz="4"/>
             </w:tcBorders>
-            <w:shd w:fill="F1ECF6" w:color="auto" w:val="clear"/>
+            <w:shd w:fill="E9F0FA" w:color="auto" w:val="clear"/>
             <w:tcMar>
               <w:top w:type="dxa" w:w="80"/>
               <w:left w:type="dxa" w:w="120"/>
@@ -1263,7 +1263,7 @@
               <w:bottom w:val="single" w:color="D9D3E3" w:sz="4"/>
               <w:right w:val="single" w:color="D9D3E3" w:sz="4"/>
             </w:tcBorders>
-            <w:shd w:fill="F1ECF6" w:color="auto" w:val="clear"/>
+            <w:shd w:fill="E9F0FA" w:color="auto" w:val="clear"/>
             <w:tcMar>
               <w:top w:type="dxa" w:w="80"/>
               <w:left w:type="dxa" w:w="120"/>
@@ -1405,7 +1405,7 @@
               <w:bottom w:val="single" w:color="D9D3E3" w:sz="4"/>
               <w:right w:val="single" w:color="D9D3E3" w:sz="4"/>
             </w:tcBorders>
-            <w:shd w:fill="F1ECF6" w:color="auto" w:val="clear"/>
+            <w:shd w:fill="E9F0FA" w:color="auto" w:val="clear"/>
             <w:tcMar>
               <w:top w:type="dxa" w:w="80"/>
               <w:left w:type="dxa" w:w="120"/>
@@ -1438,7 +1438,7 @@
               <w:bottom w:val="single" w:color="D9D3E3" w:sz="4"/>
               <w:right w:val="single" w:color="D9D3E3" w:sz="4"/>
             </w:tcBorders>
-            <w:shd w:fill="F1ECF6" w:color="auto" w:val="clear"/>
+            <w:shd w:fill="E9F0FA" w:color="auto" w:val="clear"/>
             <w:tcMar>
               <w:top w:type="dxa" w:w="80"/>
               <w:left w:type="dxa" w:w="120"/>
@@ -1471,7 +1471,7 @@
               <w:bottom w:val="single" w:color="D9D3E3" w:sz="4"/>
               <w:right w:val="single" w:color="D9D3E3" w:sz="4"/>
             </w:tcBorders>
-            <w:shd w:fill="F1ECF6" w:color="auto" w:val="clear"/>
+            <w:shd w:fill="E9F0FA" w:color="auto" w:val="clear"/>
             <w:tcMar>
               <w:top w:type="dxa" w:w="80"/>
               <w:left w:type="dxa" w:w="120"/>
@@ -1513,7 +1513,7 @@
           <w:rFonts w:ascii="Calibri" w:cs="Calibri" w:eastAsia="Calibri" w:hAnsi="Calibri"/>
           <w:b/>
           <w:bCs/>
-          <w:color w:val="4B1F6F"/>
+          <w:color w:val="00338D"/>
           <w:sz w:val="24"/>
           <w:szCs w:val="24"/>
         </w:rPr>
@@ -1544,11 +1544,11 @@
             <w:tcW w:type="pct" w:w="100%"/>
             <w:tcBorders>
               <w:top w:val="single" w:color="D9D3E3" w:sz="4"/>
-              <w:left w:val="single" w:color="B8892B" w:sz="24"/>
-              <w:bottom w:val="single" w:color="D9D3E3" w:sz="4"/>
-              <w:right w:val="single" w:color="D9D3E3" w:sz="4"/>
-            </w:tcBorders>
-            <w:shd w:fill="F6EFDE" w:color="auto" w:val="clear"/>
+              <w:left w:val="single" w:color="FDB913" w:sz="24"/>
+              <w:bottom w:val="single" w:color="D9D3E3" w:sz="4"/>
+              <w:right w:val="single" w:color="D9D3E3" w:sz="4"/>
+            </w:tcBorders>
+            <w:shd w:fill="FFF6DF" w:color="auto" w:val="clear"/>
             <w:tcMar>
               <w:top w:type="dxa" w:w="160"/>
               <w:left w:type="dxa" w:w="220"/>
@@ -1565,7 +1565,7 @@
                 <w:rFonts w:ascii="Calibri" w:cs="Calibri" w:eastAsia="Calibri" w:hAnsi="Calibri"/>
                 <w:b/>
                 <w:bCs/>
-                <w:color w:val="B8892B"/>
+                <w:color w:val="FDB913"/>
                 <w:sz w:val="20"/>
                 <w:szCs w:val="20"/>
               </w:rPr>
@@ -1594,7 +1594,7 @@
         <w:pStyle w:val="Heading1"/>
         <w:keepNext/>
         <w:pBdr>
-          <w:bottom w:val="single" w:color="B8892B" w:sz="8" w:space="6"/>
+          <w:bottom w:val="single" w:color="FDB913" w:sz="8" w:space="6"/>
         </w:pBdr>
         <w:spacing w:after="200" w:before="480"/>
       </w:pPr>
@@ -1603,7 +1603,7 @@
           <w:rFonts w:ascii="Calibri" w:cs="Calibri" w:eastAsia="Calibri" w:hAnsi="Calibri"/>
           <w:b/>
           <w:bCs/>
-          <w:color w:val="B8892B"/>
+          <w:color w:val="FDB913"/>
           <w:sz w:val="30"/>
           <w:szCs w:val="30"/>
         </w:rPr>
@@ -1614,7 +1614,7 @@
           <w:rFonts w:ascii="Calibri" w:cs="Calibri" w:eastAsia="Calibri" w:hAnsi="Calibri"/>
           <w:b/>
           <w:bCs/>
-          <w:color w:val="331153"/>
+          <w:color w:val="001F54"/>
           <w:sz w:val="30"/>
           <w:szCs w:val="30"/>
         </w:rPr>
@@ -1646,7 +1646,7 @@
           <w:rFonts w:ascii="Calibri" w:cs="Calibri" w:eastAsia="Calibri" w:hAnsi="Calibri"/>
           <w:b/>
           <w:bCs/>
-          <w:color w:val="4B1F6F"/>
+          <w:color w:val="00338D"/>
           <w:sz w:val="24"/>
           <w:szCs w:val="24"/>
         </w:rPr>
@@ -1740,7 +1740,7 @@
           <w:rFonts w:ascii="Calibri" w:cs="Calibri" w:eastAsia="Calibri" w:hAnsi="Calibri"/>
           <w:b/>
           <w:bCs/>
-          <w:color w:val="4B1F6F"/>
+          <w:color w:val="00338D"/>
           <w:sz w:val="24"/>
           <w:szCs w:val="24"/>
         </w:rPr>
@@ -1834,7 +1834,7 @@
           <w:rFonts w:ascii="Calibri" w:cs="Calibri" w:eastAsia="Calibri" w:hAnsi="Calibri"/>
           <w:b/>
           <w:bCs/>
-          <w:color w:val="4B1F6F"/>
+          <w:color w:val="00338D"/>
           <w:sz w:val="24"/>
           <w:szCs w:val="24"/>
         </w:rPr>
@@ -1860,7 +1860,7 @@
         <w:pStyle w:val="Heading1"/>
         <w:keepNext/>
         <w:pBdr>
-          <w:bottom w:val="single" w:color="B8892B" w:sz="8" w:space="6"/>
+          <w:bottom w:val="single" w:color="FDB913" w:sz="8" w:space="6"/>
         </w:pBdr>
         <w:spacing w:after="200" w:before="480"/>
       </w:pPr>
@@ -1869,7 +1869,7 @@
           <w:rFonts w:ascii="Calibri" w:cs="Calibri" w:eastAsia="Calibri" w:hAnsi="Calibri"/>
           <w:b/>
           <w:bCs/>
-          <w:color w:val="B8892B"/>
+          <w:color w:val="FDB913"/>
           <w:sz w:val="30"/>
           <w:szCs w:val="30"/>
         </w:rPr>
@@ -1880,7 +1880,7 @@
           <w:rFonts w:ascii="Calibri" w:cs="Calibri" w:eastAsia="Calibri" w:hAnsi="Calibri"/>
           <w:b/>
           <w:bCs/>
-          <w:color w:val="331153"/>
+          <w:color w:val="001F54"/>
           <w:sz w:val="30"/>
           <w:szCs w:val="30"/>
         </w:rPr>
@@ -1911,11 +1911,11 @@
             <w:tcW w:type="pct" w:w="100%"/>
             <w:tcBorders>
               <w:top w:val="single" w:color="D9D3E3" w:sz="4"/>
-              <w:left w:val="single" w:color="4B1F6F" w:sz="24"/>
-              <w:bottom w:val="single" w:color="D9D3E3" w:sz="4"/>
-              <w:right w:val="single" w:color="D9D3E3" w:sz="4"/>
-            </w:tcBorders>
-            <w:shd w:fill="F1ECF6" w:color="auto" w:val="clear"/>
+              <w:left w:val="single" w:color="00338D" w:sz="24"/>
+              <w:bottom w:val="single" w:color="D9D3E3" w:sz="4"/>
+              <w:right w:val="single" w:color="D9D3E3" w:sz="4"/>
+            </w:tcBorders>
+            <w:shd w:fill="E9F0FA" w:color="auto" w:val="clear"/>
             <w:tcMar>
               <w:top w:type="dxa" w:w="160"/>
               <w:left w:type="dxa" w:w="220"/>
@@ -1932,7 +1932,7 @@
                 <w:rFonts w:ascii="Calibri" w:cs="Calibri" w:eastAsia="Calibri" w:hAnsi="Calibri"/>
                 <w:b/>
                 <w:bCs/>
-                <w:color w:val="4B1F6F"/>
+                <w:color w:val="00338D"/>
                 <w:sz w:val="20"/>
                 <w:szCs w:val="20"/>
               </w:rPr>
@@ -1972,7 +1972,7 @@
           <w:rFonts w:ascii="Calibri" w:cs="Calibri" w:eastAsia="Calibri" w:hAnsi="Calibri"/>
           <w:b/>
           <w:bCs/>
-          <w:color w:val="4B1F6F"/>
+          <w:color w:val="00338D"/>
           <w:sz w:val="24"/>
           <w:szCs w:val="24"/>
         </w:rPr>
@@ -2012,7 +2012,7 @@
               <w:bottom w:val="single" w:color="D9D3E3" w:sz="4"/>
               <w:right w:val="single" w:color="D9D3E3" w:sz="4"/>
             </w:tcBorders>
-            <w:shd w:fill="4B1F6F" w:color="auto" w:val="clear"/>
+            <w:shd w:fill="00338D" w:color="auto" w:val="clear"/>
             <w:tcMar>
               <w:top w:type="dxa" w:w="90"/>
               <w:left w:type="dxa" w:w="120"/>
@@ -2047,7 +2047,7 @@
               <w:bottom w:val="single" w:color="D9D3E3" w:sz="4"/>
               <w:right w:val="single" w:color="D9D3E3" w:sz="4"/>
             </w:tcBorders>
-            <w:shd w:fill="4B1F6F" w:color="auto" w:val="clear"/>
+            <w:shd w:fill="00338D" w:color="auto" w:val="clear"/>
             <w:tcMar>
               <w:top w:type="dxa" w:w="90"/>
               <w:left w:type="dxa" w:w="120"/>
@@ -2082,7 +2082,7 @@
               <w:bottom w:val="single" w:color="D9D3E3" w:sz="4"/>
               <w:right w:val="single" w:color="D9D3E3" w:sz="4"/>
             </w:tcBorders>
-            <w:shd w:fill="4B1F6F" w:color="auto" w:val="clear"/>
+            <w:shd w:fill="00338D" w:color="auto" w:val="clear"/>
             <w:tcMar>
               <w:top w:type="dxa" w:w="90"/>
               <w:left w:type="dxa" w:w="120"/>
@@ -2117,7 +2117,7 @@
               <w:bottom w:val="single" w:color="D9D3E3" w:sz="4"/>
               <w:right w:val="single" w:color="D9D3E3" w:sz="4"/>
             </w:tcBorders>
-            <w:shd w:fill="4B1F6F" w:color="auto" w:val="clear"/>
+            <w:shd w:fill="00338D" w:color="auto" w:val="clear"/>
             <w:tcMar>
               <w:top w:type="dxa" w:w="90"/>
               <w:left w:type="dxa" w:w="120"/>
@@ -2152,7 +2152,7 @@
               <w:bottom w:val="single" w:color="D9D3E3" w:sz="4"/>
               <w:right w:val="single" w:color="D9D3E3" w:sz="4"/>
             </w:tcBorders>
-            <w:shd w:fill="4B1F6F" w:color="auto" w:val="clear"/>
+            <w:shd w:fill="00338D" w:color="auto" w:val="clear"/>
             <w:tcMar>
               <w:top w:type="dxa" w:w="90"/>
               <w:left w:type="dxa" w:w="120"/>
@@ -2362,7 +2362,7 @@
               <w:bottom w:val="single" w:color="D9D3E3" w:sz="4"/>
               <w:right w:val="single" w:color="D9D3E3" w:sz="4"/>
             </w:tcBorders>
-            <w:shd w:fill="F1ECF6" w:color="auto" w:val="clear"/>
+            <w:shd w:fill="E9F0FA" w:color="auto" w:val="clear"/>
             <w:tcMar>
               <w:top w:type="dxa" w:w="80"/>
               <w:left w:type="dxa" w:w="120"/>
@@ -2395,7 +2395,7 @@
               <w:bottom w:val="single" w:color="D9D3E3" w:sz="4"/>
               <w:right w:val="single" w:color="D9D3E3" w:sz="4"/>
             </w:tcBorders>
-            <w:shd w:fill="F1ECF6" w:color="auto" w:val="clear"/>
+            <w:shd w:fill="E9F0FA" w:color="auto" w:val="clear"/>
             <w:tcMar>
               <w:top w:type="dxa" w:w="80"/>
               <w:left w:type="dxa" w:w="120"/>
@@ -2428,7 +2428,7 @@
               <w:bottom w:val="single" w:color="D9D3E3" w:sz="4"/>
               <w:right w:val="single" w:color="D9D3E3" w:sz="4"/>
             </w:tcBorders>
-            <w:shd w:fill="F1ECF6" w:color="auto" w:val="clear"/>
+            <w:shd w:fill="E9F0FA" w:color="auto" w:val="clear"/>
             <w:tcMar>
               <w:top w:type="dxa" w:w="80"/>
               <w:left w:type="dxa" w:w="120"/>
@@ -2461,7 +2461,7 @@
               <w:bottom w:val="single" w:color="D9D3E3" w:sz="4"/>
               <w:right w:val="single" w:color="D9D3E3" w:sz="4"/>
             </w:tcBorders>
-            <w:shd w:fill="F1ECF6" w:color="auto" w:val="clear"/>
+            <w:shd w:fill="E9F0FA" w:color="auto" w:val="clear"/>
             <w:tcMar>
               <w:top w:type="dxa" w:w="80"/>
               <w:left w:type="dxa" w:w="120"/>
@@ -2494,7 +2494,7 @@
               <w:bottom w:val="single" w:color="D9D3E3" w:sz="4"/>
               <w:right w:val="single" w:color="D9D3E3" w:sz="4"/>
             </w:tcBorders>
-            <w:shd w:fill="F1ECF6" w:color="auto" w:val="clear"/>
+            <w:shd w:fill="E9F0FA" w:color="auto" w:val="clear"/>
             <w:tcMar>
               <w:top w:type="dxa" w:w="80"/>
               <w:left w:type="dxa" w:w="120"/>
@@ -2715,7 +2715,7 @@
           <w:rFonts w:ascii="Calibri" w:cs="Calibri" w:eastAsia="Calibri" w:hAnsi="Calibri"/>
           <w:b/>
           <w:bCs/>
-          <w:color w:val="4B1F6F"/>
+          <w:color w:val="00338D"/>
           <w:sz w:val="24"/>
           <w:szCs w:val="24"/>
         </w:rPr>
@@ -2768,7 +2768,7 @@
               <w:bottom w:val="single" w:color="D9D3E3" w:sz="4"/>
               <w:right w:val="single" w:color="D9D3E3" w:sz="4"/>
             </w:tcBorders>
-            <w:shd w:fill="4B1F6F" w:color="auto" w:val="clear"/>
+            <w:shd w:fill="00338D" w:color="auto" w:val="clear"/>
             <w:tcMar>
               <w:top w:type="dxa" w:w="90"/>
               <w:left w:type="dxa" w:w="120"/>
@@ -2803,7 +2803,7 @@
               <w:bottom w:val="single" w:color="D9D3E3" w:sz="4"/>
               <w:right w:val="single" w:color="D9D3E3" w:sz="4"/>
             </w:tcBorders>
-            <w:shd w:fill="4B1F6F" w:color="auto" w:val="clear"/>
+            <w:shd w:fill="00338D" w:color="auto" w:val="clear"/>
             <w:tcMar>
               <w:top w:type="dxa" w:w="90"/>
               <w:left w:type="dxa" w:w="120"/>
@@ -2838,7 +2838,7 @@
               <w:bottom w:val="single" w:color="D9D3E3" w:sz="4"/>
               <w:right w:val="single" w:color="D9D3E3" w:sz="4"/>
             </w:tcBorders>
-            <w:shd w:fill="4B1F6F" w:color="auto" w:val="clear"/>
+            <w:shd w:fill="00338D" w:color="auto" w:val="clear"/>
             <w:tcMar>
               <w:top w:type="dxa" w:w="90"/>
               <w:left w:type="dxa" w:w="120"/>
@@ -2873,7 +2873,7 @@
               <w:bottom w:val="single" w:color="D9D3E3" w:sz="4"/>
               <w:right w:val="single" w:color="D9D3E3" w:sz="4"/>
             </w:tcBorders>
-            <w:shd w:fill="4B1F6F" w:color="auto" w:val="clear"/>
+            <w:shd w:fill="00338D" w:color="auto" w:val="clear"/>
             <w:tcMar>
               <w:top w:type="dxa" w:w="90"/>
               <w:left w:type="dxa" w:w="120"/>
@@ -3050,7 +3050,7 @@
               <w:bottom w:val="single" w:color="D9D3E3" w:sz="4"/>
               <w:right w:val="single" w:color="D9D3E3" w:sz="4"/>
             </w:tcBorders>
-            <w:shd w:fill="F1ECF6" w:color="auto" w:val="clear"/>
+            <w:shd w:fill="E9F0FA" w:color="auto" w:val="clear"/>
             <w:tcMar>
               <w:top w:type="dxa" w:w="80"/>
               <w:left w:type="dxa" w:w="120"/>
@@ -3083,7 +3083,7 @@
               <w:bottom w:val="single" w:color="D9D3E3" w:sz="4"/>
               <w:right w:val="single" w:color="D9D3E3" w:sz="4"/>
             </w:tcBorders>
-            <w:shd w:fill="F1ECF6" w:color="auto" w:val="clear"/>
+            <w:shd w:fill="E9F0FA" w:color="auto" w:val="clear"/>
             <w:tcMar>
               <w:top w:type="dxa" w:w="80"/>
               <w:left w:type="dxa" w:w="120"/>
@@ -3116,7 +3116,7 @@
               <w:bottom w:val="single" w:color="D9D3E3" w:sz="4"/>
               <w:right w:val="single" w:color="D9D3E3" w:sz="4"/>
             </w:tcBorders>
-            <w:shd w:fill="F1ECF6" w:color="auto" w:val="clear"/>
+            <w:shd w:fill="E9F0FA" w:color="auto" w:val="clear"/>
             <w:tcMar>
               <w:top w:type="dxa" w:w="80"/>
               <w:left w:type="dxa" w:w="120"/>
@@ -3149,7 +3149,7 @@
               <w:bottom w:val="single" w:color="D9D3E3" w:sz="4"/>
               <w:right w:val="single" w:color="D9D3E3" w:sz="4"/>
             </w:tcBorders>
-            <w:shd w:fill="F1ECF6" w:color="auto" w:val="clear"/>
+            <w:shd w:fill="E9F0FA" w:color="auto" w:val="clear"/>
             <w:tcMar>
               <w:top w:type="dxa" w:w="80"/>
               <w:left w:type="dxa" w:w="120"/>
@@ -3191,7 +3191,7 @@
           <w:rFonts w:ascii="Calibri" w:cs="Calibri" w:eastAsia="Calibri" w:hAnsi="Calibri"/>
           <w:b/>
           <w:bCs/>
-          <w:color w:val="4B1F6F"/>
+          <w:color w:val="00338D"/>
           <w:sz w:val="24"/>
           <w:szCs w:val="24"/>
         </w:rPr>
@@ -3229,7 +3229,7 @@
               <w:bottom w:val="single" w:color="D9D3E3" w:sz="4"/>
               <w:right w:val="single" w:color="D9D3E3" w:sz="4"/>
             </w:tcBorders>
-            <w:shd w:fill="4B1F6F" w:color="auto" w:val="clear"/>
+            <w:shd w:fill="00338D" w:color="auto" w:val="clear"/>
             <w:tcMar>
               <w:top w:type="dxa" w:w="90"/>
               <w:left w:type="dxa" w:w="120"/>
@@ -3264,7 +3264,7 @@
               <w:bottom w:val="single" w:color="D9D3E3" w:sz="4"/>
               <w:right w:val="single" w:color="D9D3E3" w:sz="4"/>
             </w:tcBorders>
-            <w:shd w:fill="4B1F6F" w:color="auto" w:val="clear"/>
+            <w:shd w:fill="00338D" w:color="auto" w:val="clear"/>
             <w:tcMar>
               <w:top w:type="dxa" w:w="90"/>
               <w:left w:type="dxa" w:w="120"/>
@@ -3299,7 +3299,7 @@
               <w:bottom w:val="single" w:color="D9D3E3" w:sz="4"/>
               <w:right w:val="single" w:color="D9D3E3" w:sz="4"/>
             </w:tcBorders>
-            <w:shd w:fill="4B1F6F" w:color="auto" w:val="clear"/>
+            <w:shd w:fill="00338D" w:color="auto" w:val="clear"/>
             <w:tcMar>
               <w:top w:type="dxa" w:w="90"/>
               <w:left w:type="dxa" w:w="120"/>
@@ -3443,7 +3443,7 @@
               <w:bottom w:val="single" w:color="D9D3E3" w:sz="4"/>
               <w:right w:val="single" w:color="D9D3E3" w:sz="4"/>
             </w:tcBorders>
-            <w:shd w:fill="F1ECF6" w:color="auto" w:val="clear"/>
+            <w:shd w:fill="E9F0FA" w:color="auto" w:val="clear"/>
             <w:tcMar>
               <w:top w:type="dxa" w:w="80"/>
               <w:left w:type="dxa" w:w="120"/>
@@ -3476,7 +3476,7 @@
               <w:bottom w:val="single" w:color="D9D3E3" w:sz="4"/>
               <w:right w:val="single" w:color="D9D3E3" w:sz="4"/>
             </w:tcBorders>
-            <w:shd w:fill="F1ECF6" w:color="auto" w:val="clear"/>
+            <w:shd w:fill="E9F0FA" w:color="auto" w:val="clear"/>
             <w:tcMar>
               <w:top w:type="dxa" w:w="80"/>
               <w:left w:type="dxa" w:w="120"/>
@@ -3509,7 +3509,7 @@
               <w:bottom w:val="single" w:color="D9D3E3" w:sz="4"/>
               <w:right w:val="single" w:color="D9D3E3" w:sz="4"/>
             </w:tcBorders>
-            <w:shd w:fill="F1ECF6" w:color="auto" w:val="clear"/>
+            <w:shd w:fill="E9F0FA" w:color="auto" w:val="clear"/>
             <w:tcMar>
               <w:top w:type="dxa" w:w="80"/>
               <w:left w:type="dxa" w:w="120"/>
@@ -3651,7 +3651,7 @@
               <w:bottom w:val="single" w:color="D9D3E3" w:sz="4"/>
               <w:right w:val="single" w:color="D9D3E3" w:sz="4"/>
             </w:tcBorders>
-            <w:shd w:fill="F1ECF6" w:color="auto" w:val="clear"/>
+            <w:shd w:fill="E9F0FA" w:color="auto" w:val="clear"/>
             <w:tcMar>
               <w:top w:type="dxa" w:w="80"/>
               <w:left w:type="dxa" w:w="120"/>
@@ -3684,7 +3684,7 @@
               <w:bottom w:val="single" w:color="D9D3E3" w:sz="4"/>
               <w:right w:val="single" w:color="D9D3E3" w:sz="4"/>
             </w:tcBorders>
-            <w:shd w:fill="F1ECF6" w:color="auto" w:val="clear"/>
+            <w:shd w:fill="E9F0FA" w:color="auto" w:val="clear"/>
             <w:tcMar>
               <w:top w:type="dxa" w:w="80"/>
               <w:left w:type="dxa" w:w="120"/>
@@ -3717,7 +3717,7 @@
               <w:bottom w:val="single" w:color="D9D3E3" w:sz="4"/>
               <w:right w:val="single" w:color="D9D3E3" w:sz="4"/>
             </w:tcBorders>
-            <w:shd w:fill="F1ECF6" w:color="auto" w:val="clear"/>
+            <w:shd w:fill="E9F0FA" w:color="auto" w:val="clear"/>
             <w:tcMar>
               <w:top w:type="dxa" w:w="80"/>
               <w:left w:type="dxa" w:w="120"/>
@@ -3863,7 +3863,7 @@
           <w:rFonts w:ascii="Calibri" w:cs="Calibri" w:eastAsia="Calibri" w:hAnsi="Calibri"/>
           <w:b/>
           <w:bCs/>
-          <w:color w:val="4B1F6F"/>
+          <w:color w:val="00338D"/>
           <w:sz w:val="24"/>
           <w:szCs w:val="24"/>
         </w:rPr>
@@ -3915,7 +3915,7 @@
               <w:bottom w:val="single" w:color="D9D3E3" w:sz="4"/>
               <w:right w:val="single" w:color="D9D3E3" w:sz="4"/>
             </w:tcBorders>
-            <w:shd w:fill="4B1F6F" w:color="auto" w:val="clear"/>
+            <w:shd w:fill="00338D" w:color="auto" w:val="clear"/>
             <w:tcMar>
               <w:top w:type="dxa" w:w="90"/>
               <w:left w:type="dxa" w:w="120"/>
@@ -3950,7 +3950,7 @@
               <w:bottom w:val="single" w:color="D9D3E3" w:sz="4"/>
               <w:right w:val="single" w:color="D9D3E3" w:sz="4"/>
             </w:tcBorders>
-            <w:shd w:fill="4B1F6F" w:color="auto" w:val="clear"/>
+            <w:shd w:fill="00338D" w:color="auto" w:val="clear"/>
             <w:tcMar>
               <w:top w:type="dxa" w:w="90"/>
               <w:left w:type="dxa" w:w="120"/>
@@ -3985,7 +3985,7 @@
               <w:bottom w:val="single" w:color="D9D3E3" w:sz="4"/>
               <w:right w:val="single" w:color="D9D3E3" w:sz="4"/>
             </w:tcBorders>
-            <w:shd w:fill="4B1F6F" w:color="auto" w:val="clear"/>
+            <w:shd w:fill="00338D" w:color="auto" w:val="clear"/>
             <w:tcMar>
               <w:top w:type="dxa" w:w="90"/>
               <w:left w:type="dxa" w:w="120"/>
@@ -4129,7 +4129,7 @@
               <w:bottom w:val="single" w:color="D9D3E3" w:sz="4"/>
               <w:right w:val="single" w:color="D9D3E3" w:sz="4"/>
             </w:tcBorders>
-            <w:shd w:fill="F1ECF6" w:color="auto" w:val="clear"/>
+            <w:shd w:fill="E9F0FA" w:color="auto" w:val="clear"/>
             <w:tcMar>
               <w:top w:type="dxa" w:w="80"/>
               <w:left w:type="dxa" w:w="120"/>
@@ -4162,7 +4162,7 @@
               <w:bottom w:val="single" w:color="D9D3E3" w:sz="4"/>
               <w:right w:val="single" w:color="D9D3E3" w:sz="4"/>
             </w:tcBorders>
-            <w:shd w:fill="F1ECF6" w:color="auto" w:val="clear"/>
+            <w:shd w:fill="E9F0FA" w:color="auto" w:val="clear"/>
             <w:tcMar>
               <w:top w:type="dxa" w:w="80"/>
               <w:left w:type="dxa" w:w="120"/>
@@ -4195,7 +4195,7 @@
               <w:bottom w:val="single" w:color="D9D3E3" w:sz="4"/>
               <w:right w:val="single" w:color="D9D3E3" w:sz="4"/>
             </w:tcBorders>
-            <w:shd w:fill="F1ECF6" w:color="auto" w:val="clear"/>
+            <w:shd w:fill="E9F0FA" w:color="auto" w:val="clear"/>
             <w:tcMar>
               <w:top w:type="dxa" w:w="80"/>
               <w:left w:type="dxa" w:w="120"/>
@@ -4337,7 +4337,7 @@
               <w:bottom w:val="single" w:color="D9D3E3" w:sz="4"/>
               <w:right w:val="single" w:color="D9D3E3" w:sz="4"/>
             </w:tcBorders>
-            <w:shd w:fill="F1ECF6" w:color="auto" w:val="clear"/>
+            <w:shd w:fill="E9F0FA" w:color="auto" w:val="clear"/>
             <w:tcMar>
               <w:top w:type="dxa" w:w="80"/>
               <w:left w:type="dxa" w:w="120"/>
@@ -4370,7 +4370,7 @@
               <w:bottom w:val="single" w:color="D9D3E3" w:sz="4"/>
               <w:right w:val="single" w:color="D9D3E3" w:sz="4"/>
             </w:tcBorders>
-            <w:shd w:fill="F1ECF6" w:color="auto" w:val="clear"/>
+            <w:shd w:fill="E9F0FA" w:color="auto" w:val="clear"/>
             <w:tcMar>
               <w:top w:type="dxa" w:w="80"/>
               <w:left w:type="dxa" w:w="120"/>
@@ -4403,7 +4403,7 @@
               <w:bottom w:val="single" w:color="D9D3E3" w:sz="4"/>
               <w:right w:val="single" w:color="D9D3E3" w:sz="4"/>
             </w:tcBorders>
-            <w:shd w:fill="F1ECF6" w:color="auto" w:val="clear"/>
+            <w:shd w:fill="E9F0FA" w:color="auto" w:val="clear"/>
             <w:tcMar>
               <w:top w:type="dxa" w:w="80"/>
               <w:left w:type="dxa" w:w="120"/>
@@ -4562,11 +4562,11 @@
             <w:tcW w:type="pct" w:w="100%"/>
             <w:tcBorders>
               <w:top w:val="single" w:color="D9D3E3" w:sz="4"/>
-              <w:left w:val="single" w:color="B8892B" w:sz="24"/>
-              <w:bottom w:val="single" w:color="D9D3E3" w:sz="4"/>
-              <w:right w:val="single" w:color="D9D3E3" w:sz="4"/>
-            </w:tcBorders>
-            <w:shd w:fill="F6EFDE" w:color="auto" w:val="clear"/>
+              <w:left w:val="single" w:color="FDB913" w:sz="24"/>
+              <w:bottom w:val="single" w:color="D9D3E3" w:sz="4"/>
+              <w:right w:val="single" w:color="D9D3E3" w:sz="4"/>
+            </w:tcBorders>
+            <w:shd w:fill="FFF6DF" w:color="auto" w:val="clear"/>
             <w:tcMar>
               <w:top w:type="dxa" w:w="160"/>
               <w:left w:type="dxa" w:w="220"/>
@@ -4583,7 +4583,7 @@
                 <w:rFonts w:ascii="Calibri" w:cs="Calibri" w:eastAsia="Calibri" w:hAnsi="Calibri"/>
                 <w:b/>
                 <w:bCs/>
-                <w:color w:val="B8892B"/>
+                <w:color w:val="FDB913"/>
                 <w:sz w:val="20"/>
                 <w:szCs w:val="20"/>
               </w:rPr>
@@ -4612,7 +4612,7 @@
         <w:pStyle w:val="Heading1"/>
         <w:keepNext/>
         <w:pBdr>
-          <w:bottom w:val="single" w:color="B8892B" w:sz="8" w:space="6"/>
+          <w:bottom w:val="single" w:color="FDB913" w:sz="8" w:space="6"/>
         </w:pBdr>
         <w:spacing w:after="200" w:before="480"/>
       </w:pPr>
@@ -4621,7 +4621,7 @@
           <w:rFonts w:ascii="Calibri" w:cs="Calibri" w:eastAsia="Calibri" w:hAnsi="Calibri"/>
           <w:b/>
           <w:bCs/>
-          <w:color w:val="B8892B"/>
+          <w:color w:val="FDB913"/>
           <w:sz w:val="30"/>
           <w:szCs w:val="30"/>
         </w:rPr>
@@ -4632,7 +4632,7 @@
           <w:rFonts w:ascii="Calibri" w:cs="Calibri" w:eastAsia="Calibri" w:hAnsi="Calibri"/>
           <w:b/>
           <w:bCs/>
-          <w:color w:val="331153"/>
+          <w:color w:val="001F54"/>
           <w:sz w:val="30"/>
           <w:szCs w:val="30"/>
         </w:rPr>
@@ -4650,7 +4650,7 @@
           <w:rFonts w:ascii="Calibri" w:cs="Calibri" w:eastAsia="Calibri" w:hAnsi="Calibri"/>
           <w:b/>
           <w:bCs/>
-          <w:color w:val="4B1F6F"/>
+          <w:color w:val="00338D"/>
           <w:sz w:val="24"/>
           <w:szCs w:val="24"/>
         </w:rPr>
@@ -4744,7 +4744,7 @@
           <w:rFonts w:ascii="Calibri" w:cs="Calibri" w:eastAsia="Calibri" w:hAnsi="Calibri"/>
           <w:b/>
           <w:bCs/>
-          <w:color w:val="4B1F6F"/>
+          <w:color w:val="00338D"/>
           <w:sz w:val="24"/>
           <w:szCs w:val="24"/>
         </w:rPr>
@@ -4838,7 +4838,7 @@
           <w:rFonts w:ascii="Calibri" w:cs="Calibri" w:eastAsia="Calibri" w:hAnsi="Calibri"/>
           <w:b/>
           <w:bCs/>
-          <w:color w:val="4B1F6F"/>
+          <w:color w:val="00338D"/>
           <w:sz w:val="24"/>
           <w:szCs w:val="24"/>
         </w:rPr>
@@ -4889,7 +4889,7 @@
               <w:bottom w:val="single" w:color="D9D3E3" w:sz="4"/>
               <w:right w:val="single" w:color="D9D3E3" w:sz="4"/>
             </w:tcBorders>
-            <w:shd w:fill="4B1F6F" w:color="auto" w:val="clear"/>
+            <w:shd w:fill="00338D" w:color="auto" w:val="clear"/>
             <w:tcMar>
               <w:top w:type="dxa" w:w="90"/>
               <w:left w:type="dxa" w:w="120"/>
@@ -4924,7 +4924,7 @@
               <w:bottom w:val="single" w:color="D9D3E3" w:sz="4"/>
               <w:right w:val="single" w:color="D9D3E3" w:sz="4"/>
             </w:tcBorders>
-            <w:shd w:fill="4B1F6F" w:color="auto" w:val="clear"/>
+            <w:shd w:fill="00338D" w:color="auto" w:val="clear"/>
             <w:tcMar>
               <w:top w:type="dxa" w:w="90"/>
               <w:left w:type="dxa" w:w="120"/>
@@ -5035,7 +5035,7 @@
               <w:bottom w:val="single" w:color="D9D3E3" w:sz="4"/>
               <w:right w:val="single" w:color="D9D3E3" w:sz="4"/>
             </w:tcBorders>
-            <w:shd w:fill="F1ECF6" w:color="auto" w:val="clear"/>
+            <w:shd w:fill="E9F0FA" w:color="auto" w:val="clear"/>
             <w:tcMar>
               <w:top w:type="dxa" w:w="80"/>
               <w:left w:type="dxa" w:w="120"/>
@@ -5068,7 +5068,7 @@
               <w:bottom w:val="single" w:color="D9D3E3" w:sz="4"/>
               <w:right w:val="single" w:color="D9D3E3" w:sz="4"/>
             </w:tcBorders>
-            <w:shd w:fill="F1ECF6" w:color="auto" w:val="clear"/>
+            <w:shd w:fill="E9F0FA" w:color="auto" w:val="clear"/>
             <w:tcMar>
               <w:top w:type="dxa" w:w="80"/>
               <w:left w:type="dxa" w:w="120"/>
@@ -5177,7 +5177,7 @@
               <w:bottom w:val="single" w:color="D9D3E3" w:sz="4"/>
               <w:right w:val="single" w:color="D9D3E3" w:sz="4"/>
             </w:tcBorders>
-            <w:shd w:fill="F1ECF6" w:color="auto" w:val="clear"/>
+            <w:shd w:fill="E9F0FA" w:color="auto" w:val="clear"/>
             <w:tcMar>
               <w:top w:type="dxa" w:w="80"/>
               <w:left w:type="dxa" w:w="120"/>
@@ -5210,7 +5210,7 @@
               <w:bottom w:val="single" w:color="D9D3E3" w:sz="4"/>
               <w:right w:val="single" w:color="D9D3E3" w:sz="4"/>
             </w:tcBorders>
-            <w:shd w:fill="F1ECF6" w:color="auto" w:val="clear"/>
+            <w:shd w:fill="E9F0FA" w:color="auto" w:val="clear"/>
             <w:tcMar>
               <w:top w:type="dxa" w:w="80"/>
               <w:left w:type="dxa" w:w="120"/>
@@ -5374,7 +5374,7 @@
         <w:pStyle w:val="Heading1"/>
         <w:keepNext/>
         <w:pBdr>
-          <w:bottom w:val="single" w:color="B8892B" w:sz="8" w:space="6"/>
+          <w:bottom w:val="single" w:color="FDB913" w:sz="8" w:space="6"/>
         </w:pBdr>
         <w:spacing w:after="200" w:before="480"/>
       </w:pPr>
@@ -5383,7 +5383,7 @@
           <w:rFonts w:ascii="Calibri" w:cs="Calibri" w:eastAsia="Calibri" w:hAnsi="Calibri"/>
           <w:b/>
           <w:bCs/>
-          <w:color w:val="B8892B"/>
+          <w:color w:val="FDB913"/>
           <w:sz w:val="30"/>
           <w:szCs w:val="30"/>
         </w:rPr>
@@ -5394,7 +5394,7 @@
           <w:rFonts w:ascii="Calibri" w:cs="Calibri" w:eastAsia="Calibri" w:hAnsi="Calibri"/>
           <w:b/>
           <w:bCs/>
-          <w:color w:val="331153"/>
+          <w:color w:val="001F54"/>
           <w:sz w:val="30"/>
           <w:szCs w:val="30"/>
         </w:rPr>
@@ -5412,7 +5412,7 @@
           <w:rFonts w:ascii="Calibri" w:cs="Calibri" w:eastAsia="Calibri" w:hAnsi="Calibri"/>
           <w:b/>
           <w:bCs/>
-          <w:color w:val="4B1F6F"/>
+          <w:color w:val="00338D"/>
           <w:sz w:val="24"/>
           <w:szCs w:val="24"/>
         </w:rPr>
@@ -5450,7 +5450,7 @@
               <w:bottom w:val="single" w:color="D9D3E3" w:sz="4"/>
               <w:right w:val="single" w:color="D9D3E3" w:sz="4"/>
             </w:tcBorders>
-            <w:shd w:fill="4B1F6F" w:color="auto" w:val="clear"/>
+            <w:shd w:fill="00338D" w:color="auto" w:val="clear"/>
             <w:tcMar>
               <w:top w:type="dxa" w:w="90"/>
               <w:left w:type="dxa" w:w="120"/>
@@ -5485,7 +5485,7 @@
               <w:bottom w:val="single" w:color="D9D3E3" w:sz="4"/>
               <w:right w:val="single" w:color="D9D3E3" w:sz="4"/>
             </w:tcBorders>
-            <w:shd w:fill="4B1F6F" w:color="auto" w:val="clear"/>
+            <w:shd w:fill="00338D" w:color="auto" w:val="clear"/>
             <w:tcMar>
               <w:top w:type="dxa" w:w="90"/>
               <w:left w:type="dxa" w:w="120"/>
@@ -5520,7 +5520,7 @@
               <w:bottom w:val="single" w:color="D9D3E3" w:sz="4"/>
               <w:right w:val="single" w:color="D9D3E3" w:sz="4"/>
             </w:tcBorders>
-            <w:shd w:fill="4B1F6F" w:color="auto" w:val="clear"/>
+            <w:shd w:fill="00338D" w:color="auto" w:val="clear"/>
             <w:tcMar>
               <w:top w:type="dxa" w:w="90"/>
               <w:left w:type="dxa" w:w="120"/>
@@ -5664,7 +5664,7 @@
               <w:bottom w:val="single" w:color="D9D3E3" w:sz="4"/>
               <w:right w:val="single" w:color="D9D3E3" w:sz="4"/>
             </w:tcBorders>
-            <w:shd w:fill="F1ECF6" w:color="auto" w:val="clear"/>
+            <w:shd w:fill="E9F0FA" w:color="auto" w:val="clear"/>
             <w:tcMar>
               <w:top w:type="dxa" w:w="80"/>
               <w:left w:type="dxa" w:w="120"/>
@@ -5697,7 +5697,7 @@
               <w:bottom w:val="single" w:color="D9D3E3" w:sz="4"/>
               <w:right w:val="single" w:color="D9D3E3" w:sz="4"/>
             </w:tcBorders>
-            <w:shd w:fill="F1ECF6" w:color="auto" w:val="clear"/>
+            <w:shd w:fill="E9F0FA" w:color="auto" w:val="clear"/>
             <w:tcMar>
               <w:top w:type="dxa" w:w="80"/>
               <w:left w:type="dxa" w:w="120"/>
@@ -5730,7 +5730,7 @@
               <w:bottom w:val="single" w:color="D9D3E3" w:sz="4"/>
               <w:right w:val="single" w:color="D9D3E3" w:sz="4"/>
             </w:tcBorders>
-            <w:shd w:fill="F1ECF6" w:color="auto" w:val="clear"/>
+            <w:shd w:fill="E9F0FA" w:color="auto" w:val="clear"/>
             <w:tcMar>
               <w:top w:type="dxa" w:w="80"/>
               <w:left w:type="dxa" w:w="120"/>
@@ -5887,7 +5887,7 @@
           <w:rFonts w:ascii="Calibri" w:cs="Calibri" w:eastAsia="Calibri" w:hAnsi="Calibri"/>
           <w:b/>
           <w:bCs/>
-          <w:color w:val="4B1F6F"/>
+          <w:color w:val="00338D"/>
           <w:sz w:val="24"/>
           <w:szCs w:val="24"/>
         </w:rPr>
@@ -6000,7 +6000,7 @@
           <w:rFonts w:ascii="Calibri" w:cs="Calibri" w:eastAsia="Calibri" w:hAnsi="Calibri"/>
           <w:b/>
           <w:bCs/>
-          <w:color w:val="4B1F6F"/>
+          <w:color w:val="00338D"/>
           <w:sz w:val="24"/>
           <w:szCs w:val="24"/>
         </w:rPr>
@@ -6088,7 +6088,7 @@
         <w:pStyle w:val="Heading1"/>
         <w:keepNext/>
         <w:pBdr>
-          <w:bottom w:val="single" w:color="B8892B" w:sz="8" w:space="6"/>
+          <w:bottom w:val="single" w:color="FDB913" w:sz="8" w:space="6"/>
         </w:pBdr>
         <w:spacing w:after="200" w:before="480"/>
       </w:pPr>
@@ -6097,7 +6097,7 @@
           <w:rFonts w:ascii="Calibri" w:cs="Calibri" w:eastAsia="Calibri" w:hAnsi="Calibri"/>
           <w:b/>
           <w:bCs/>
-          <w:color w:val="B8892B"/>
+          <w:color w:val="FDB913"/>
           <w:sz w:val="30"/>
           <w:szCs w:val="30"/>
         </w:rPr>
@@ -6108,7 +6108,7 @@
           <w:rFonts w:ascii="Calibri" w:cs="Calibri" w:eastAsia="Calibri" w:hAnsi="Calibri"/>
           <w:b/>
           <w:bCs/>
-          <w:color w:val="331153"/>
+          <w:color w:val="001F54"/>
           <w:sz w:val="30"/>
           <w:szCs w:val="30"/>
         </w:rPr>
@@ -6140,7 +6140,7 @@
           <w:rFonts w:ascii="Calibri" w:cs="Calibri" w:eastAsia="Calibri" w:hAnsi="Calibri"/>
           <w:b/>
           <w:bCs/>
-          <w:color w:val="4B1F6F"/>
+          <w:color w:val="00338D"/>
           <w:sz w:val="24"/>
           <w:szCs w:val="24"/>
         </w:rPr>
@@ -6178,7 +6178,7 @@
               <w:bottom w:val="single" w:color="D9D3E3" w:sz="4"/>
               <w:right w:val="single" w:color="D9D3E3" w:sz="4"/>
             </w:tcBorders>
-            <w:shd w:fill="4B1F6F" w:color="auto" w:val="clear"/>
+            <w:shd w:fill="00338D" w:color="auto" w:val="clear"/>
             <w:tcMar>
               <w:top w:type="dxa" w:w="90"/>
               <w:left w:type="dxa" w:w="120"/>
@@ -6213,7 +6213,7 @@
               <w:bottom w:val="single" w:color="D9D3E3" w:sz="4"/>
               <w:right w:val="single" w:color="D9D3E3" w:sz="4"/>
             </w:tcBorders>
-            <w:shd w:fill="4B1F6F" w:color="auto" w:val="clear"/>
+            <w:shd w:fill="00338D" w:color="auto" w:val="clear"/>
             <w:tcMar>
               <w:top w:type="dxa" w:w="90"/>
               <w:left w:type="dxa" w:w="120"/>
@@ -6248,7 +6248,7 @@
               <w:bottom w:val="single" w:color="D9D3E3" w:sz="4"/>
               <w:right w:val="single" w:color="D9D3E3" w:sz="4"/>
             </w:tcBorders>
-            <w:shd w:fill="4B1F6F" w:color="auto" w:val="clear"/>
+            <w:shd w:fill="00338D" w:color="auto" w:val="clear"/>
             <w:tcMar>
               <w:top w:type="dxa" w:w="90"/>
               <w:left w:type="dxa" w:w="120"/>
@@ -6392,7 +6392,7 @@
               <w:bottom w:val="single" w:color="D9D3E3" w:sz="4"/>
               <w:right w:val="single" w:color="D9D3E3" w:sz="4"/>
             </w:tcBorders>
-            <w:shd w:fill="F1ECF6" w:color="auto" w:val="clear"/>
+            <w:shd w:fill="E9F0FA" w:color="auto" w:val="clear"/>
             <w:tcMar>
               <w:top w:type="dxa" w:w="80"/>
               <w:left w:type="dxa" w:w="120"/>
@@ -6425,7 +6425,7 @@
               <w:bottom w:val="single" w:color="D9D3E3" w:sz="4"/>
               <w:right w:val="single" w:color="D9D3E3" w:sz="4"/>
             </w:tcBorders>
-            <w:shd w:fill="F1ECF6" w:color="auto" w:val="clear"/>
+            <w:shd w:fill="E9F0FA" w:color="auto" w:val="clear"/>
             <w:tcMar>
               <w:top w:type="dxa" w:w="80"/>
               <w:left w:type="dxa" w:w="120"/>
@@ -6458,7 +6458,7 @@
               <w:bottom w:val="single" w:color="D9D3E3" w:sz="4"/>
               <w:right w:val="single" w:color="D9D3E3" w:sz="4"/>
             </w:tcBorders>
-            <w:shd w:fill="F1ECF6" w:color="auto" w:val="clear"/>
+            <w:shd w:fill="E9F0FA" w:color="auto" w:val="clear"/>
             <w:tcMar>
               <w:top w:type="dxa" w:w="80"/>
               <w:left w:type="dxa" w:w="120"/>
@@ -6600,7 +6600,7 @@
               <w:bottom w:val="single" w:color="D9D3E3" w:sz="4"/>
               <w:right w:val="single" w:color="D9D3E3" w:sz="4"/>
             </w:tcBorders>
-            <w:shd w:fill="F1ECF6" w:color="auto" w:val="clear"/>
+            <w:shd w:fill="E9F0FA" w:color="auto" w:val="clear"/>
             <w:tcMar>
               <w:top w:type="dxa" w:w="80"/>
               <w:left w:type="dxa" w:w="120"/>
@@ -6633,7 +6633,7 @@
               <w:bottom w:val="single" w:color="D9D3E3" w:sz="4"/>
               <w:right w:val="single" w:color="D9D3E3" w:sz="4"/>
             </w:tcBorders>
-            <w:shd w:fill="F1ECF6" w:color="auto" w:val="clear"/>
+            <w:shd w:fill="E9F0FA" w:color="auto" w:val="clear"/>
             <w:tcMar>
               <w:top w:type="dxa" w:w="80"/>
               <w:left w:type="dxa" w:w="120"/>
@@ -6666,7 +6666,7 @@
               <w:bottom w:val="single" w:color="D9D3E3" w:sz="4"/>
               <w:right w:val="single" w:color="D9D3E3" w:sz="4"/>
             </w:tcBorders>
-            <w:shd w:fill="F1ECF6" w:color="auto" w:val="clear"/>
+            <w:shd w:fill="E9F0FA" w:color="auto" w:val="clear"/>
             <w:tcMar>
               <w:top w:type="dxa" w:w="80"/>
               <w:left w:type="dxa" w:w="120"/>
@@ -6808,7 +6808,7 @@
               <w:bottom w:val="single" w:color="D9D3E3" w:sz="4"/>
               <w:right w:val="single" w:color="D9D3E3" w:sz="4"/>
             </w:tcBorders>
-            <w:shd w:fill="F1ECF6" w:color="auto" w:val="clear"/>
+            <w:shd w:fill="E9F0FA" w:color="auto" w:val="clear"/>
             <w:tcMar>
               <w:top w:type="dxa" w:w="80"/>
               <w:left w:type="dxa" w:w="120"/>
@@ -6841,7 +6841,7 @@
               <w:bottom w:val="single" w:color="D9D3E3" w:sz="4"/>
               <w:right w:val="single" w:color="D9D3E3" w:sz="4"/>
             </w:tcBorders>
-            <w:shd w:fill="F1ECF6" w:color="auto" w:val="clear"/>
+            <w:shd w:fill="E9F0FA" w:color="auto" w:val="clear"/>
             <w:tcMar>
               <w:top w:type="dxa" w:w="80"/>
               <w:left w:type="dxa" w:w="120"/>
@@ -6874,7 +6874,7 @@
               <w:bottom w:val="single" w:color="D9D3E3" w:sz="4"/>
               <w:right w:val="single" w:color="D9D3E3" w:sz="4"/>
             </w:tcBorders>
-            <w:shd w:fill="F1ECF6" w:color="auto" w:val="clear"/>
+            <w:shd w:fill="E9F0FA" w:color="auto" w:val="clear"/>
             <w:tcMar>
               <w:top w:type="dxa" w:w="80"/>
               <w:left w:type="dxa" w:w="120"/>
@@ -6916,7 +6916,7 @@
           <w:rFonts w:ascii="Calibri" w:cs="Calibri" w:eastAsia="Calibri" w:hAnsi="Calibri"/>
           <w:b/>
           <w:bCs/>
-          <w:color w:val="4B1F6F"/>
+          <w:color w:val="00338D"/>
           <w:sz w:val="24"/>
           <w:szCs w:val="24"/>
         </w:rPr>
@@ -6933,7 +6933,7 @@
           <w:rFonts w:ascii="Calibri" w:cs="Calibri" w:eastAsia="Calibri" w:hAnsi="Calibri"/>
           <w:b/>
           <w:bCs/>
-          <w:color w:val="4B1F6F"/>
+          <w:color w:val="00338D"/>
           <w:sz w:val="21"/>
           <w:szCs w:val="21"/>
         </w:rPr>
@@ -6959,7 +6959,7 @@
           <w:rFonts w:ascii="Calibri" w:cs="Calibri" w:eastAsia="Calibri" w:hAnsi="Calibri"/>
           <w:b/>
           <w:bCs/>
-          <w:color w:val="4B1F6F"/>
+          <w:color w:val="00338D"/>
           <w:sz w:val="21"/>
           <w:szCs w:val="21"/>
         </w:rPr>
@@ -6985,7 +6985,7 @@
           <w:rFonts w:ascii="Calibri" w:cs="Calibri" w:eastAsia="Calibri" w:hAnsi="Calibri"/>
           <w:b/>
           <w:bCs/>
-          <w:color w:val="4B1F6F"/>
+          <w:color w:val="00338D"/>
           <w:sz w:val="21"/>
           <w:szCs w:val="21"/>
         </w:rPr>
@@ -7011,7 +7011,7 @@
           <w:rFonts w:ascii="Calibri" w:cs="Calibri" w:eastAsia="Calibri" w:hAnsi="Calibri"/>
           <w:b/>
           <w:bCs/>
-          <w:color w:val="4B1F6F"/>
+          <w:color w:val="00338D"/>
           <w:sz w:val="21"/>
           <w:szCs w:val="21"/>
         </w:rPr>
@@ -7037,7 +7037,7 @@
           <w:rFonts w:ascii="Calibri" w:cs="Calibri" w:eastAsia="Calibri" w:hAnsi="Calibri"/>
           <w:b/>
           <w:bCs/>
-          <w:color w:val="4B1F6F"/>
+          <w:color w:val="00338D"/>
           <w:sz w:val="21"/>
           <w:szCs w:val="21"/>
         </w:rPr>
@@ -7063,7 +7063,7 @@
           <w:rFonts w:ascii="Calibri" w:cs="Calibri" w:eastAsia="Calibri" w:hAnsi="Calibri"/>
           <w:b/>
           <w:bCs/>
-          <w:color w:val="4B1F6F"/>
+          <w:color w:val="00338D"/>
           <w:sz w:val="21"/>
           <w:szCs w:val="21"/>
         </w:rPr>
@@ -7089,7 +7089,7 @@
           <w:rFonts w:ascii="Calibri" w:cs="Calibri" w:eastAsia="Calibri" w:hAnsi="Calibri"/>
           <w:b/>
           <w:bCs/>
-          <w:color w:val="4B1F6F"/>
+          <w:color w:val="00338D"/>
           <w:sz w:val="21"/>
           <w:szCs w:val="21"/>
         </w:rPr>
@@ -7110,7 +7110,7 @@
         <w:pStyle w:val="Heading1"/>
         <w:keepNext/>
         <w:pBdr>
-          <w:bottom w:val="single" w:color="B8892B" w:sz="8" w:space="6"/>
+          <w:bottom w:val="single" w:color="FDB913" w:sz="8" w:space="6"/>
         </w:pBdr>
         <w:spacing w:after="200" w:before="480"/>
       </w:pPr>
@@ -7119,7 +7119,7 @@
           <w:rFonts w:ascii="Calibri" w:cs="Calibri" w:eastAsia="Calibri" w:hAnsi="Calibri"/>
           <w:b/>
           <w:bCs/>
-          <w:color w:val="B8892B"/>
+          <w:color w:val="FDB913"/>
           <w:sz w:val="30"/>
           <w:szCs w:val="30"/>
         </w:rPr>
@@ -7130,7 +7130,7 @@
           <w:rFonts w:ascii="Calibri" w:cs="Calibri" w:eastAsia="Calibri" w:hAnsi="Calibri"/>
           <w:b/>
           <w:bCs/>
-          <w:color w:val="331153"/>
+          <w:color w:val="001F54"/>
           <w:sz w:val="30"/>
           <w:szCs w:val="30"/>
         </w:rPr>
@@ -7168,7 +7168,7 @@
               <w:bottom w:val="single" w:color="D9D3E3" w:sz="4"/>
               <w:right w:val="single" w:color="D9D3E3" w:sz="4"/>
             </w:tcBorders>
-            <w:shd w:fill="4B1F6F" w:color="auto" w:val="clear"/>
+            <w:shd w:fill="00338D" w:color="auto" w:val="clear"/>
             <w:tcMar>
               <w:top w:type="dxa" w:w="90"/>
               <w:left w:type="dxa" w:w="120"/>
@@ -7203,7 +7203,7 @@
               <w:bottom w:val="single" w:color="D9D3E3" w:sz="4"/>
               <w:right w:val="single" w:color="D9D3E3" w:sz="4"/>
             </w:tcBorders>
-            <w:shd w:fill="4B1F6F" w:color="auto" w:val="clear"/>
+            <w:shd w:fill="00338D" w:color="auto" w:val="clear"/>
             <w:tcMar>
               <w:top w:type="dxa" w:w="90"/>
               <w:left w:type="dxa" w:w="120"/>
@@ -7238,7 +7238,7 @@
               <w:bottom w:val="single" w:color="D9D3E3" w:sz="4"/>
               <w:right w:val="single" w:color="D9D3E3" w:sz="4"/>
             </w:tcBorders>
-            <w:shd w:fill="4B1F6F" w:color="auto" w:val="clear"/>
+            <w:shd w:fill="00338D" w:color="auto" w:val="clear"/>
             <w:tcMar>
               <w:top w:type="dxa" w:w="90"/>
               <w:left w:type="dxa" w:w="120"/>
@@ -7382,7 +7382,7 @@
               <w:bottom w:val="single" w:color="D9D3E3" w:sz="4"/>
               <w:right w:val="single" w:color="D9D3E3" w:sz="4"/>
             </w:tcBorders>
-            <w:shd w:fill="F1ECF6" w:color="auto" w:val="clear"/>
+            <w:shd w:fill="E9F0FA" w:color="auto" w:val="clear"/>
             <w:tcMar>
               <w:top w:type="dxa" w:w="80"/>
               <w:left w:type="dxa" w:w="120"/>
@@ -7415,7 +7415,7 @@
               <w:bottom w:val="single" w:color="D9D3E3" w:sz="4"/>
               <w:right w:val="single" w:color="D9D3E3" w:sz="4"/>
             </w:tcBorders>
-            <w:shd w:fill="F1ECF6" w:color="auto" w:val="clear"/>
+            <w:shd w:fill="E9F0FA" w:color="auto" w:val="clear"/>
             <w:tcMar>
               <w:top w:type="dxa" w:w="80"/>
               <w:left w:type="dxa" w:w="120"/>
@@ -7448,7 +7448,7 @@
               <w:bottom w:val="single" w:color="D9D3E3" w:sz="4"/>
               <w:right w:val="single" w:color="D9D3E3" w:sz="4"/>
             </w:tcBorders>
-            <w:shd w:fill="F1ECF6" w:color="auto" w:val="clear"/>
+            <w:shd w:fill="E9F0FA" w:color="auto" w:val="clear"/>
             <w:tcMar>
               <w:top w:type="dxa" w:w="80"/>
               <w:left w:type="dxa" w:w="120"/>
@@ -7590,7 +7590,7 @@
               <w:bottom w:val="single" w:color="D9D3E3" w:sz="4"/>
               <w:right w:val="single" w:color="D9D3E3" w:sz="4"/>
             </w:tcBorders>
-            <w:shd w:fill="F1ECF6" w:color="auto" w:val="clear"/>
+            <w:shd w:fill="E9F0FA" w:color="auto" w:val="clear"/>
             <w:tcMar>
               <w:top w:type="dxa" w:w="80"/>
               <w:left w:type="dxa" w:w="120"/>
@@ -7623,7 +7623,7 @@
               <w:bottom w:val="single" w:color="D9D3E3" w:sz="4"/>
               <w:right w:val="single" w:color="D9D3E3" w:sz="4"/>
             </w:tcBorders>
-            <w:shd w:fill="F1ECF6" w:color="auto" w:val="clear"/>
+            <w:shd w:fill="E9F0FA" w:color="auto" w:val="clear"/>
             <w:tcMar>
               <w:top w:type="dxa" w:w="80"/>
               <w:left w:type="dxa" w:w="120"/>
@@ -7656,7 +7656,7 @@
               <w:bottom w:val="single" w:color="D9D3E3" w:sz="4"/>
               <w:right w:val="single" w:color="D9D3E3" w:sz="4"/>
             </w:tcBorders>
-            <w:shd w:fill="F1ECF6" w:color="auto" w:val="clear"/>
+            <w:shd w:fill="E9F0FA" w:color="auto" w:val="clear"/>
             <w:tcMar>
               <w:top w:type="dxa" w:w="80"/>
               <w:left w:type="dxa" w:w="120"/>
@@ -7711,11 +7711,11 @@
             <w:tcW w:type="pct" w:w="100%"/>
             <w:tcBorders>
               <w:top w:val="single" w:color="D9D3E3" w:sz="4"/>
-              <w:left w:val="single" w:color="B8892B" w:sz="24"/>
-              <w:bottom w:val="single" w:color="D9D3E3" w:sz="4"/>
-              <w:right w:val="single" w:color="D9D3E3" w:sz="4"/>
-            </w:tcBorders>
-            <w:shd w:fill="F6EFDE" w:color="auto" w:val="clear"/>
+              <w:left w:val="single" w:color="FDB913" w:sz="24"/>
+              <w:bottom w:val="single" w:color="D9D3E3" w:sz="4"/>
+              <w:right w:val="single" w:color="D9D3E3" w:sz="4"/>
+            </w:tcBorders>
+            <w:shd w:fill="FFF6DF" w:color="auto" w:val="clear"/>
             <w:tcMar>
               <w:top w:type="dxa" w:w="160"/>
               <w:left w:type="dxa" w:w="220"/>
@@ -7732,7 +7732,7 @@
                 <w:rFonts w:ascii="Calibri" w:cs="Calibri" w:eastAsia="Calibri" w:hAnsi="Calibri"/>
                 <w:b/>
                 <w:bCs/>
-                <w:color w:val="B8892B"/>
+                <w:color w:val="FDB913"/>
                 <w:sz w:val="20"/>
                 <w:szCs w:val="20"/>
               </w:rPr>
@@ -7761,7 +7761,7 @@
         <w:pStyle w:val="Heading1"/>
         <w:keepNext/>
         <w:pBdr>
-          <w:bottom w:val="single" w:color="B8892B" w:sz="8" w:space="6"/>
+          <w:bottom w:val="single" w:color="FDB913" w:sz="8" w:space="6"/>
         </w:pBdr>
         <w:spacing w:after="200" w:before="480"/>
       </w:pPr>
@@ -7770,7 +7770,7 @@
           <w:rFonts w:ascii="Calibri" w:cs="Calibri" w:eastAsia="Calibri" w:hAnsi="Calibri"/>
           <w:b/>
           <w:bCs/>
-          <w:color w:val="B8892B"/>
+          <w:color w:val="FDB913"/>
           <w:sz w:val="30"/>
           <w:szCs w:val="30"/>
         </w:rPr>
@@ -7781,7 +7781,7 @@
           <w:rFonts w:ascii="Calibri" w:cs="Calibri" w:eastAsia="Calibri" w:hAnsi="Calibri"/>
           <w:b/>
           <w:bCs/>
-          <w:color w:val="331153"/>
+          <w:color w:val="001F54"/>
           <w:sz w:val="30"/>
           <w:szCs w:val="30"/>
         </w:rPr>
@@ -7819,7 +7819,7 @@
               <w:bottom w:val="single" w:color="D9D3E3" w:sz="4"/>
               <w:right w:val="single" w:color="D9D3E3" w:sz="4"/>
             </w:tcBorders>
-            <w:shd w:fill="4B1F6F" w:color="auto" w:val="clear"/>
+            <w:shd w:fill="00338D" w:color="auto" w:val="clear"/>
             <w:tcMar>
               <w:top w:type="dxa" w:w="90"/>
               <w:left w:type="dxa" w:w="120"/>
@@ -7854,7 +7854,7 @@
               <w:bottom w:val="single" w:color="D9D3E3" w:sz="4"/>
               <w:right w:val="single" w:color="D9D3E3" w:sz="4"/>
             </w:tcBorders>
-            <w:shd w:fill="4B1F6F" w:color="auto" w:val="clear"/>
+            <w:shd w:fill="00338D" w:color="auto" w:val="clear"/>
             <w:tcMar>
               <w:top w:type="dxa" w:w="90"/>
               <w:left w:type="dxa" w:w="120"/>
@@ -7889,7 +7889,7 @@
               <w:bottom w:val="single" w:color="D9D3E3" w:sz="4"/>
               <w:right w:val="single" w:color="D9D3E3" w:sz="4"/>
             </w:tcBorders>
-            <w:shd w:fill="4B1F6F" w:color="auto" w:val="clear"/>
+            <w:shd w:fill="00338D" w:color="auto" w:val="clear"/>
             <w:tcMar>
               <w:top w:type="dxa" w:w="90"/>
               <w:left w:type="dxa" w:w="120"/>
@@ -8033,7 +8033,7 @@
               <w:bottom w:val="single" w:color="D9D3E3" w:sz="4"/>
               <w:right w:val="single" w:color="D9D3E3" w:sz="4"/>
             </w:tcBorders>
-            <w:shd w:fill="F1ECF6" w:color="auto" w:val="clear"/>
+            <w:shd w:fill="E9F0FA" w:color="auto" w:val="clear"/>
             <w:tcMar>
               <w:top w:type="dxa" w:w="80"/>
               <w:left w:type="dxa" w:w="120"/>
@@ -8066,7 +8066,7 @@
               <w:bottom w:val="single" w:color="D9D3E3" w:sz="4"/>
               <w:right w:val="single" w:color="D9D3E3" w:sz="4"/>
             </w:tcBorders>
-            <w:shd w:fill="F1ECF6" w:color="auto" w:val="clear"/>
+            <w:shd w:fill="E9F0FA" w:color="auto" w:val="clear"/>
             <w:tcMar>
               <w:top w:type="dxa" w:w="80"/>
               <w:left w:type="dxa" w:w="120"/>
@@ -8099,7 +8099,7 @@
               <w:bottom w:val="single" w:color="D9D3E3" w:sz="4"/>
               <w:right w:val="single" w:color="D9D3E3" w:sz="4"/>
             </w:tcBorders>
-            <w:shd w:fill="F1ECF6" w:color="auto" w:val="clear"/>
+            <w:shd w:fill="E9F0FA" w:color="auto" w:val="clear"/>
             <w:tcMar>
               <w:top w:type="dxa" w:w="80"/>
               <w:left w:type="dxa" w:w="120"/>
@@ -8241,7 +8241,7 @@
               <w:bottom w:val="single" w:color="D9D3E3" w:sz="4"/>
               <w:right w:val="single" w:color="D9D3E3" w:sz="4"/>
             </w:tcBorders>
-            <w:shd w:fill="F1ECF6" w:color="auto" w:val="clear"/>
+            <w:shd w:fill="E9F0FA" w:color="auto" w:val="clear"/>
             <w:tcMar>
               <w:top w:type="dxa" w:w="80"/>
               <w:left w:type="dxa" w:w="120"/>
@@ -8274,7 +8274,7 @@
               <w:bottom w:val="single" w:color="D9D3E3" w:sz="4"/>
               <w:right w:val="single" w:color="D9D3E3" w:sz="4"/>
             </w:tcBorders>
-            <w:shd w:fill="F1ECF6" w:color="auto" w:val="clear"/>
+            <w:shd w:fill="E9F0FA" w:color="auto" w:val="clear"/>
             <w:tcMar>
               <w:top w:type="dxa" w:w="80"/>
               <w:left w:type="dxa" w:w="120"/>
@@ -8307,7 +8307,7 @@
               <w:bottom w:val="single" w:color="D9D3E3" w:sz="4"/>
               <w:right w:val="single" w:color="D9D3E3" w:sz="4"/>
             </w:tcBorders>
-            <w:shd w:fill="F1ECF6" w:color="auto" w:val="clear"/>
+            <w:shd w:fill="E9F0FA" w:color="auto" w:val="clear"/>
             <w:tcMar>
               <w:top w:type="dxa" w:w="80"/>
               <w:left w:type="dxa" w:w="120"/>
@@ -8449,7 +8449,7 @@
               <w:bottom w:val="single" w:color="D9D3E3" w:sz="4"/>
               <w:right w:val="single" w:color="D9D3E3" w:sz="4"/>
             </w:tcBorders>
-            <w:shd w:fill="F1ECF6" w:color="auto" w:val="clear"/>
+            <w:shd w:fill="E9F0FA" w:color="auto" w:val="clear"/>
             <w:tcMar>
               <w:top w:type="dxa" w:w="80"/>
               <w:left w:type="dxa" w:w="120"/>
@@ -8482,7 +8482,7 @@
               <w:bottom w:val="single" w:color="D9D3E3" w:sz="4"/>
               <w:right w:val="single" w:color="D9D3E3" w:sz="4"/>
             </w:tcBorders>
-            <w:shd w:fill="F1ECF6" w:color="auto" w:val="clear"/>
+            <w:shd w:fill="E9F0FA" w:color="auto" w:val="clear"/>
             <w:tcMar>
               <w:top w:type="dxa" w:w="80"/>
               <w:left w:type="dxa" w:w="120"/>
@@ -8515,7 +8515,7 @@
               <w:bottom w:val="single" w:color="D9D3E3" w:sz="4"/>
               <w:right w:val="single" w:color="D9D3E3" w:sz="4"/>
             </w:tcBorders>
-            <w:shd w:fill="F1ECF6" w:color="auto" w:val="clear"/>
+            <w:shd w:fill="E9F0FA" w:color="auto" w:val="clear"/>
             <w:tcMar>
               <w:top w:type="dxa" w:w="80"/>
               <w:left w:type="dxa" w:w="120"/>
@@ -8657,7 +8657,7 @@
               <w:bottom w:val="single" w:color="D9D3E3" w:sz="4"/>
               <w:right w:val="single" w:color="D9D3E3" w:sz="4"/>
             </w:tcBorders>
-            <w:shd w:fill="F1ECF6" w:color="auto" w:val="clear"/>
+            <w:shd w:fill="E9F0FA" w:color="auto" w:val="clear"/>
             <w:tcMar>
               <w:top w:type="dxa" w:w="80"/>
               <w:left w:type="dxa" w:w="120"/>
@@ -8690,7 +8690,7 @@
               <w:bottom w:val="single" w:color="D9D3E3" w:sz="4"/>
               <w:right w:val="single" w:color="D9D3E3" w:sz="4"/>
             </w:tcBorders>
-            <w:shd w:fill="F1ECF6" w:color="auto" w:val="clear"/>
+            <w:shd w:fill="E9F0FA" w:color="auto" w:val="clear"/>
             <w:tcMar>
               <w:top w:type="dxa" w:w="80"/>
               <w:left w:type="dxa" w:w="120"/>
@@ -8723,7 +8723,7 @@
               <w:bottom w:val="single" w:color="D9D3E3" w:sz="4"/>
               <w:right w:val="single" w:color="D9D3E3" w:sz="4"/>
             </w:tcBorders>
-            <w:shd w:fill="F1ECF6" w:color="auto" w:val="clear"/>
+            <w:shd w:fill="E9F0FA" w:color="auto" w:val="clear"/>
             <w:tcMar>
               <w:top w:type="dxa" w:w="80"/>
               <w:left w:type="dxa" w:w="120"/>
@@ -8754,7 +8754,7 @@
         <w:pStyle w:val="Heading1"/>
         <w:keepNext/>
         <w:pBdr>
-          <w:bottom w:val="single" w:color="B8892B" w:sz="8" w:space="6"/>
+          <w:bottom w:val="single" w:color="FDB913" w:sz="8" w:space="6"/>
         </w:pBdr>
         <w:spacing w:after="200" w:before="480"/>
       </w:pPr>
@@ -8763,7 +8763,7 @@
           <w:rFonts w:ascii="Calibri" w:cs="Calibri" w:eastAsia="Calibri" w:hAnsi="Calibri"/>
           <w:b/>
           <w:bCs/>
-          <w:color w:val="B8892B"/>
+          <w:color w:val="FDB913"/>
           <w:sz w:val="30"/>
           <w:szCs w:val="30"/>
         </w:rPr>
@@ -8774,7 +8774,7 @@
           <w:rFonts w:ascii="Calibri" w:cs="Calibri" w:eastAsia="Calibri" w:hAnsi="Calibri"/>
           <w:b/>
           <w:bCs/>
-          <w:color w:val="331153"/>
+          <w:color w:val="001F54"/>
           <w:sz w:val="30"/>
           <w:szCs w:val="30"/>
         </w:rPr>
@@ -8993,7 +8993,7 @@
         <w:pStyle w:val="Heading1"/>
         <w:keepNext/>
         <w:pBdr>
-          <w:bottom w:val="single" w:color="B8892B" w:sz="8" w:space="6"/>
+          <w:bottom w:val="single" w:color="FDB913" w:sz="8" w:space="6"/>
         </w:pBdr>
         <w:spacing w:after="200" w:before="480"/>
       </w:pPr>
@@ -9002,7 +9002,7 @@
           <w:rFonts w:ascii="Calibri" w:cs="Calibri" w:eastAsia="Calibri" w:hAnsi="Calibri"/>
           <w:b/>
           <w:bCs/>
-          <w:color w:val="B8892B"/>
+          <w:color w:val="FDB913"/>
           <w:sz w:val="30"/>
           <w:szCs w:val="30"/>
         </w:rPr>
@@ -9013,7 +9013,7 @@
           <w:rFonts w:ascii="Calibri" w:cs="Calibri" w:eastAsia="Calibri" w:hAnsi="Calibri"/>
           <w:b/>
           <w:bCs/>
-          <w:color w:val="331153"/>
+          <w:color w:val="001F54"/>
           <w:sz w:val="30"/>
           <w:szCs w:val="30"/>
         </w:rPr>
@@ -9053,7 +9053,7 @@
         <w:pStyle w:val="Heading1"/>
         <w:keepNext/>
         <w:pBdr>
-          <w:bottom w:val="single" w:color="B8892B" w:sz="8" w:space="6"/>
+          <w:bottom w:val="single" w:color="FDB913" w:sz="8" w:space="6"/>
         </w:pBdr>
         <w:spacing w:after="200" w:before="480"/>
       </w:pPr>
@@ -9062,7 +9062,7 @@
           <w:rFonts w:ascii="Calibri" w:cs="Calibri" w:eastAsia="Calibri" w:hAnsi="Calibri"/>
           <w:b/>
           <w:bCs/>
-          <w:color w:val="B8892B"/>
+          <w:color w:val="FDB913"/>
           <w:sz w:val="30"/>
           <w:szCs w:val="30"/>
         </w:rPr>
@@ -9073,7 +9073,7 @@
           <w:rFonts w:ascii="Calibri" w:cs="Calibri" w:eastAsia="Calibri" w:hAnsi="Calibri"/>
           <w:b/>
           <w:bCs/>
-          <w:color w:val="331153"/>
+          <w:color w:val="001F54"/>
           <w:sz w:val="30"/>
           <w:szCs w:val="30"/>
         </w:rPr>
@@ -9091,7 +9091,7 @@
           <w:rFonts w:ascii="Calibri" w:cs="Calibri" w:eastAsia="Calibri" w:hAnsi="Calibri"/>
           <w:b/>
           <w:bCs/>
-          <w:color w:val="4B1F6F"/>
+          <w:color w:val="00338D"/>
           <w:sz w:val="24"/>
           <w:szCs w:val="24"/>
         </w:rPr>
@@ -9147,7 +9147,7 @@
           <w:rFonts w:ascii="Calibri" w:cs="Calibri" w:eastAsia="Calibri" w:hAnsi="Calibri"/>
           <w:b/>
           <w:bCs/>
-          <w:color w:val="4B1F6F"/>
+          <w:color w:val="00338D"/>
           <w:sz w:val="24"/>
           <w:szCs w:val="24"/>
         </w:rPr>
@@ -9259,7 +9259,7 @@
         <w:pStyle w:val="Heading1"/>
         <w:keepNext/>
         <w:pBdr>
-          <w:bottom w:val="single" w:color="B8892B" w:sz="8" w:space="6"/>
+          <w:bottom w:val="single" w:color="FDB913" w:sz="8" w:space="6"/>
         </w:pBdr>
         <w:spacing w:after="200" w:before="480"/>
       </w:pPr>
@@ -9268,7 +9268,7 @@
           <w:rFonts w:ascii="Calibri" w:cs="Calibri" w:eastAsia="Calibri" w:hAnsi="Calibri"/>
           <w:b/>
           <w:bCs/>
-          <w:color w:val="B8892B"/>
+          <w:color w:val="FDB913"/>
           <w:sz w:val="30"/>
           <w:szCs w:val="30"/>
         </w:rPr>
@@ -9279,7 +9279,7 @@
           <w:rFonts w:ascii="Calibri" w:cs="Calibri" w:eastAsia="Calibri" w:hAnsi="Calibri"/>
           <w:b/>
           <w:bCs/>
-          <w:color w:val="331153"/>
+          <w:color w:val="001F54"/>
           <w:sz w:val="30"/>
           <w:szCs w:val="30"/>
         </w:rPr>
@@ -9359,7 +9359,7 @@
           <w:rFonts w:ascii="Calibri" w:cs="Calibri" w:eastAsia="Calibri" w:hAnsi="Calibri"/>
           <w:b/>
           <w:bCs/>
-          <w:color w:val="331153"/>
+          <w:color w:val="001F54"/>
           <w:sz w:val="19"/>
           <w:szCs w:val="19"/>
         </w:rPr>
@@ -9431,7 +9431,7 @@
           <w:rFonts w:ascii="Calibri" w:cs="Calibri" w:eastAsia="Calibri" w:hAnsi="Calibri"/>
           <w:b/>
           <w:bCs/>
-          <w:color w:val="331153"/>
+          <w:color w:val="001F54"/>
           <w:sz w:val="19"/>
           <w:szCs w:val="19"/>
         </w:rPr>
@@ -9503,7 +9503,7 @@
           <w:rFonts w:ascii="Calibri" w:cs="Calibri" w:eastAsia="Calibri" w:hAnsi="Calibri"/>
           <w:b/>
           <w:bCs/>
-          <w:color w:val="331153"/>
+          <w:color w:val="001F54"/>
           <w:sz w:val="19"/>
           <w:szCs w:val="19"/>
         </w:rPr>
@@ -9575,7 +9575,7 @@
           <w:rFonts w:ascii="Calibri" w:cs="Calibri" w:eastAsia="Calibri" w:hAnsi="Calibri"/>
           <w:b/>
           <w:bCs/>
-          <w:color w:val="331153"/>
+          <w:color w:val="001F54"/>
           <w:sz w:val="19"/>
           <w:szCs w:val="19"/>
         </w:rPr>
@@ -9763,7 +9763,7 @@
         <w:rFonts w:ascii="Calibri" w:cs="Calibri" w:eastAsia="Calibri" w:hAnsi="Calibri"/>
         <w:b/>
         <w:bCs/>
-        <w:color w:val="4B1F6F"/>
+        <w:color w:val="00338D"/>
         <w:sz w:val="16"/>
         <w:szCs w:val="16"/>
       </w:rPr>

</xml_diff>

<commit_message>
Usar el logo y colores exactos verificados de Lions Clubs International
Se descargaron los 4 archivos de logo oficiales desde Google Drive
(coincidentes con el kit de marca de Lions Clubs International) y se
extrajeron los colores reales por muestreo de píxeles: azul #00529B y
dorado #FFCF00 (más una variante oscurecida del dorado para texto
legible sobre blanco). Se reemplaza el placeholder decorativo de la
portada por el logo real del Club "Leones en Acción" en el informe y
en la presentación.
Co-Authored-By: Claude Sonnet 5 <noreply@anthropic.com>
Claude-Session: https://claude.ai/code/session_01UWKZXqoHYVxY6r86dsip31
</commit_message>
<xml_diff>
--- a/informes/Informe_Complementario_Modelo_Arriendo_Club_Leones_Z144.docx
+++ b/informes/Informe_Complementario_Modelo_Arriendo_Club_Leones_Z144.docx
@@ -4,7 +4,53 @@
   <w:body>
     <w:p>
       <w:pPr>
-        <w:spacing w:after="0" w:before="900"/>
+        <w:spacing w:after="200" w:before="500"/>
+        <w:jc w:val="center"/>
+      </w:pPr>
+      <w:r>
+        <w:drawing>
+          <wp:inline distT="0" distB="0" distL="0" distR="0">
+            <wp:extent cx="1219200" cy="1209675"/>
+            <wp:effectExtent t="0" r="0" b="0" l="0"/>
+            <wp:docPr id="1" name="" descr="" title=""/>
+            <wp:cNvGraphicFramePr>
+              <a:graphicFrameLocks xmlns:a="http://schemas.openxmlformats.org/drawingml/2006/main" noChangeAspect="1"/>
+            </wp:cNvGraphicFramePr>
+            <a:graphic xmlns:a="http://schemas.openxmlformats.org/drawingml/2006/main">
+              <a:graphicData uri="http://schemas.openxmlformats.org/drawingml/2006/picture">
+                <pic:pic xmlns:pic="http://schemas.openxmlformats.org/drawingml/2006/picture">
+                  <pic:nvPicPr>
+                    <pic:cNvPr id="0" name="" descr=""/>
+                    <pic:cNvPicPr>
+                      <a:picLocks noChangeAspect="1" noChangeArrowheads="1"/>
+                    </pic:cNvPicPr>
+                  </pic:nvPicPr>
+                  <pic:blipFill>
+                    <a:blip r:embed="rId11" cstate="none"/>
+                    <a:srcRect/>
+                    <a:stretch>
+                      <a:fillRect/>
+                    </a:stretch>
+                  </pic:blipFill>
+                  <pic:spPr bwMode="auto">
+                    <a:xfrm>
+                      <a:off x="0" y="0"/>
+                      <a:ext cx="1219200" cy="1209675"/>
+                    </a:xfrm>
+                    <a:prstGeom prst="rect">
+                      <a:avLst/>
+                    </a:prstGeom>
+                  </pic:spPr>
+                </pic:pic>
+              </a:graphicData>
+            </a:graphic>
+          </wp:inline>
+        </w:drawing>
+      </w:r>
+    </w:p>
+    <w:p>
+      <w:pPr>
+        <w:spacing w:after="0" w:before="200"/>
         <w:jc w:val="center"/>
       </w:pPr>
       <w:r>
@@ -12,7 +58,7 @@
           <w:rFonts w:ascii="Calibri" w:cs="Calibri" w:eastAsia="Calibri" w:hAnsi="Calibri"/>
           <w:b/>
           <w:bCs/>
-          <w:color w:val="FDB913"/>
+          <w:color w:val="8C7200"/>
           <w:spacing w:val="20"/>
           <w:sz w:val="24"/>
           <w:szCs w:val="24"/>
@@ -45,7 +91,7 @@
           <w:rFonts w:ascii="Calibri" w:cs="Calibri" w:eastAsia="Calibri" w:hAnsi="Calibri"/>
           <w:b/>
           <w:bCs/>
-          <w:color w:val="001F54"/>
+          <w:color w:val="002D55"/>
           <w:sz w:val="56"/>
           <w:szCs w:val="56"/>
         </w:rPr>
@@ -62,7 +108,7 @@
           <w:rFonts w:ascii="Calibri" w:cs="Calibri" w:eastAsia="Calibri" w:hAnsi="Calibri"/>
           <w:b/>
           <w:bCs/>
-          <w:color w:val="00338D"/>
+          <w:color w:val="00529B"/>
           <w:sz w:val="40"/>
           <w:szCs w:val="40"/>
         </w:rPr>
@@ -131,7 +177,7 @@
                 <w:rFonts w:ascii="Calibri" w:cs="Calibri" w:eastAsia="Calibri" w:hAnsi="Calibri"/>
                 <w:b/>
                 <w:bCs/>
-                <w:color w:val="00338D"/>
+                <w:color w:val="00529B"/>
                 <w:sz w:val="19"/>
                 <w:szCs w:val="19"/>
               </w:rPr>
@@ -193,7 +239,7 @@
                 <w:rFonts w:ascii="Calibri" w:cs="Calibri" w:eastAsia="Calibri" w:hAnsi="Calibri"/>
                 <w:b/>
                 <w:bCs/>
-                <w:color w:val="00338D"/>
+                <w:color w:val="00529B"/>
                 <w:sz w:val="19"/>
                 <w:szCs w:val="19"/>
               </w:rPr>
@@ -255,7 +301,7 @@
                 <w:rFonts w:ascii="Calibri" w:cs="Calibri" w:eastAsia="Calibri" w:hAnsi="Calibri"/>
                 <w:b/>
                 <w:bCs/>
-                <w:color w:val="00338D"/>
+                <w:color w:val="00529B"/>
                 <w:sz w:val="19"/>
                 <w:szCs w:val="19"/>
               </w:rPr>
@@ -317,7 +363,7 @@
                 <w:rFonts w:ascii="Calibri" w:cs="Calibri" w:eastAsia="Calibri" w:hAnsi="Calibri"/>
                 <w:b/>
                 <w:bCs/>
-                <w:color w:val="00338D"/>
+                <w:color w:val="00529B"/>
                 <w:sz w:val="19"/>
                 <w:szCs w:val="19"/>
               </w:rPr>
@@ -365,7 +411,7 @@
       <w:pPr>
         <w:pStyle w:val="Heading1"/>
         <w:pBdr>
-          <w:bottom w:val="single" w:color="FDB913" w:sz="8" w:space="6"/>
+          <w:bottom w:val="single" w:color="FFCF00" w:sz="8" w:space="6"/>
         </w:pBdr>
         <w:spacing w:after="200"/>
       </w:pPr>
@@ -374,7 +420,7 @@
           <w:rFonts w:ascii="Calibri" w:cs="Calibri" w:eastAsia="Calibri" w:hAnsi="Calibri"/>
           <w:b/>
           <w:bCs/>
-          <w:color w:val="001F54"/>
+          <w:color w:val="002D55"/>
           <w:sz w:val="30"/>
           <w:szCs w:val="30"/>
         </w:rPr>
@@ -428,7 +474,7 @@
               <w:bottom w:val="none" w:color="FFFFFF" w:sz="0"/>
               <w:right w:val="single" w:color="FFFFFF" w:sz="4"/>
             </w:tcBorders>
-            <w:shd w:fill="E9F0FA" w:color="auto" w:val="clear"/>
+            <w:shd w:fill="E8F0F8" w:color="auto" w:val="clear"/>
             <w:tcMar>
               <w:top w:type="dxa" w:w="160"/>
               <w:left w:type="dxa" w:w="100"/>
@@ -446,7 +492,7 @@
                 <w:rFonts w:ascii="Calibri" w:cs="Calibri" w:eastAsia="Calibri" w:hAnsi="Calibri"/>
                 <w:b/>
                 <w:bCs/>
-                <w:color w:val="001F54"/>
+                <w:color w:val="002D55"/>
                 <w:sz w:val="28"/>
                 <w:szCs w:val="28"/>
               </w:rPr>
@@ -477,7 +523,7 @@
               <w:bottom w:val="none" w:color="FFFFFF" w:sz="0"/>
               <w:right w:val="single" w:color="FFFFFF" w:sz="4"/>
             </w:tcBorders>
-            <w:shd w:fill="E9F0FA" w:color="auto" w:val="clear"/>
+            <w:shd w:fill="E8F0F8" w:color="auto" w:val="clear"/>
             <w:tcMar>
               <w:top w:type="dxa" w:w="160"/>
               <w:left w:type="dxa" w:w="100"/>
@@ -495,7 +541,7 @@
                 <w:rFonts w:ascii="Calibri" w:cs="Calibri" w:eastAsia="Calibri" w:hAnsi="Calibri"/>
                 <w:b/>
                 <w:bCs/>
-                <w:color w:val="001F54"/>
+                <w:color w:val="002D55"/>
                 <w:sz w:val="28"/>
                 <w:szCs w:val="28"/>
               </w:rPr>
@@ -526,7 +572,7 @@
               <w:bottom w:val="none" w:color="FFFFFF" w:sz="0"/>
               <w:right w:val="single" w:color="FFFFFF" w:sz="4"/>
             </w:tcBorders>
-            <w:shd w:fill="E9F0FA" w:color="auto" w:val="clear"/>
+            <w:shd w:fill="E8F0F8" w:color="auto" w:val="clear"/>
             <w:tcMar>
               <w:top w:type="dxa" w:w="160"/>
               <w:left w:type="dxa" w:w="100"/>
@@ -544,7 +590,7 @@
                 <w:rFonts w:ascii="Calibri" w:cs="Calibri" w:eastAsia="Calibri" w:hAnsi="Calibri"/>
                 <w:b/>
                 <w:bCs/>
-                <w:color w:val="001F54"/>
+                <w:color w:val="002D55"/>
                 <w:sz w:val="28"/>
                 <w:szCs w:val="28"/>
               </w:rPr>
@@ -575,7 +621,7 @@
               <w:bottom w:val="none" w:color="FFFFFF" w:sz="0"/>
               <w:right w:val="single" w:color="FFFFFF" w:sz="4"/>
             </w:tcBorders>
-            <w:shd w:fill="E9F0FA" w:color="auto" w:val="clear"/>
+            <w:shd w:fill="E8F0F8" w:color="auto" w:val="clear"/>
             <w:tcMar>
               <w:top w:type="dxa" w:w="160"/>
               <w:left w:type="dxa" w:w="100"/>
@@ -593,7 +639,7 @@
                 <w:rFonts w:ascii="Calibri" w:cs="Calibri" w:eastAsia="Calibri" w:hAnsi="Calibri"/>
                 <w:b/>
                 <w:bCs/>
-                <w:color w:val="001F54"/>
+                <w:color w:val="002D55"/>
                 <w:sz w:val="28"/>
                 <w:szCs w:val="28"/>
               </w:rPr>
@@ -646,11 +692,11 @@
             <w:tcW w:type="pct" w:w="100%"/>
             <w:tcBorders>
               <w:top w:val="single" w:color="D9D3E3" w:sz="4"/>
-              <w:left w:val="single" w:color="00338D" w:sz="24"/>
-              <w:bottom w:val="single" w:color="D9D3E3" w:sz="4"/>
-              <w:right w:val="single" w:color="D9D3E3" w:sz="4"/>
-            </w:tcBorders>
-            <w:shd w:fill="E9F0FA" w:color="auto" w:val="clear"/>
+              <w:left w:val="single" w:color="00529B" w:sz="24"/>
+              <w:bottom w:val="single" w:color="D9D3E3" w:sz="4"/>
+              <w:right w:val="single" w:color="D9D3E3" w:sz="4"/>
+            </w:tcBorders>
+            <w:shd w:fill="E8F0F8" w:color="auto" w:val="clear"/>
             <w:tcMar>
               <w:top w:type="dxa" w:w="160"/>
               <w:left w:type="dxa" w:w="220"/>
@@ -667,7 +713,7 @@
                 <w:rFonts w:ascii="Calibri" w:cs="Calibri" w:eastAsia="Calibri" w:hAnsi="Calibri"/>
                 <w:b/>
                 <w:bCs/>
-                <w:color w:val="00338D"/>
+                <w:color w:val="00529B"/>
                 <w:sz w:val="20"/>
                 <w:szCs w:val="20"/>
               </w:rPr>
@@ -707,7 +753,7 @@
           <w:rFonts w:ascii="Calibri" w:cs="Calibri" w:eastAsia="Calibri" w:hAnsi="Calibri"/>
           <w:b/>
           <w:bCs/>
-          <w:color w:val="00338D"/>
+          <w:color w:val="00529B"/>
           <w:sz w:val="24"/>
           <w:szCs w:val="24"/>
         </w:rPr>
@@ -825,7 +871,7 @@
           <w:rFonts w:ascii="Calibri" w:cs="Calibri" w:eastAsia="Calibri" w:hAnsi="Calibri"/>
           <w:b/>
           <w:bCs/>
-          <w:color w:val="00338D"/>
+          <w:color w:val="00529B"/>
           <w:sz w:val="24"/>
           <w:szCs w:val="24"/>
         </w:rPr>
@@ -856,7 +902,7 @@
         <w:pStyle w:val="Heading1"/>
         <w:keepNext/>
         <w:pBdr>
-          <w:bottom w:val="single" w:color="FDB913" w:sz="8" w:space="6"/>
+          <w:bottom w:val="single" w:color="FFCF00" w:sz="8" w:space="6"/>
         </w:pBdr>
         <w:spacing w:after="200" w:before="480"/>
       </w:pPr>
@@ -865,7 +911,7 @@
           <w:rFonts w:ascii="Calibri" w:cs="Calibri" w:eastAsia="Calibri" w:hAnsi="Calibri"/>
           <w:b/>
           <w:bCs/>
-          <w:color w:val="FDB913"/>
+          <w:color w:val="8C7200"/>
           <w:sz w:val="30"/>
           <w:szCs w:val="30"/>
         </w:rPr>
@@ -876,7 +922,7 @@
           <w:rFonts w:ascii="Calibri" w:cs="Calibri" w:eastAsia="Calibri" w:hAnsi="Calibri"/>
           <w:b/>
           <w:bCs/>
-          <w:color w:val="001F54"/>
+          <w:color w:val="002D55"/>
           <w:sz w:val="30"/>
           <w:szCs w:val="30"/>
         </w:rPr>
@@ -894,7 +940,7 @@
           <w:rFonts w:ascii="Calibri" w:cs="Calibri" w:eastAsia="Calibri" w:hAnsi="Calibri"/>
           <w:b/>
           <w:bCs/>
-          <w:color w:val="00338D"/>
+          <w:color w:val="00529B"/>
           <w:sz w:val="24"/>
           <w:szCs w:val="24"/>
         </w:rPr>
@@ -926,7 +972,7 @@
           <w:rFonts w:ascii="Calibri" w:cs="Calibri" w:eastAsia="Calibri" w:hAnsi="Calibri"/>
           <w:b/>
           <w:bCs/>
-          <w:color w:val="00338D"/>
+          <w:color w:val="00529B"/>
           <w:sz w:val="24"/>
           <w:szCs w:val="24"/>
         </w:rPr>
@@ -983,7 +1029,7 @@
               <w:bottom w:val="single" w:color="D9D3E3" w:sz="4"/>
               <w:right w:val="single" w:color="D9D3E3" w:sz="4"/>
             </w:tcBorders>
-            <w:shd w:fill="00338D" w:color="auto" w:val="clear"/>
+            <w:shd w:fill="00529B" w:color="auto" w:val="clear"/>
             <w:tcMar>
               <w:top w:type="dxa" w:w="90"/>
               <w:left w:type="dxa" w:w="120"/>
@@ -1018,7 +1064,7 @@
               <w:bottom w:val="single" w:color="D9D3E3" w:sz="4"/>
               <w:right w:val="single" w:color="D9D3E3" w:sz="4"/>
             </w:tcBorders>
-            <w:shd w:fill="00338D" w:color="auto" w:val="clear"/>
+            <w:shd w:fill="00529B" w:color="auto" w:val="clear"/>
             <w:tcMar>
               <w:top w:type="dxa" w:w="90"/>
               <w:left w:type="dxa" w:w="120"/>
@@ -1053,7 +1099,7 @@
               <w:bottom w:val="single" w:color="D9D3E3" w:sz="4"/>
               <w:right w:val="single" w:color="D9D3E3" w:sz="4"/>
             </w:tcBorders>
-            <w:shd w:fill="00338D" w:color="auto" w:val="clear"/>
+            <w:shd w:fill="00529B" w:color="auto" w:val="clear"/>
             <w:tcMar>
               <w:top w:type="dxa" w:w="90"/>
               <w:left w:type="dxa" w:w="120"/>
@@ -1197,7 +1243,7 @@
               <w:bottom w:val="single" w:color="D9D3E3" w:sz="4"/>
               <w:right w:val="single" w:color="D9D3E3" w:sz="4"/>
             </w:tcBorders>
-            <w:shd w:fill="E9F0FA" w:color="auto" w:val="clear"/>
+            <w:shd w:fill="E8F0F8" w:color="auto" w:val="clear"/>
             <w:tcMar>
               <w:top w:type="dxa" w:w="80"/>
               <w:left w:type="dxa" w:w="120"/>
@@ -1230,7 +1276,7 @@
               <w:bottom w:val="single" w:color="D9D3E3" w:sz="4"/>
               <w:right w:val="single" w:color="D9D3E3" w:sz="4"/>
             </w:tcBorders>
-            <w:shd w:fill="E9F0FA" w:color="auto" w:val="clear"/>
+            <w:shd w:fill="E8F0F8" w:color="auto" w:val="clear"/>
             <w:tcMar>
               <w:top w:type="dxa" w:w="80"/>
               <w:left w:type="dxa" w:w="120"/>
@@ -1263,7 +1309,7 @@
               <w:bottom w:val="single" w:color="D9D3E3" w:sz="4"/>
               <w:right w:val="single" w:color="D9D3E3" w:sz="4"/>
             </w:tcBorders>
-            <w:shd w:fill="E9F0FA" w:color="auto" w:val="clear"/>
+            <w:shd w:fill="E8F0F8" w:color="auto" w:val="clear"/>
             <w:tcMar>
               <w:top w:type="dxa" w:w="80"/>
               <w:left w:type="dxa" w:w="120"/>
@@ -1405,7 +1451,7 @@
               <w:bottom w:val="single" w:color="D9D3E3" w:sz="4"/>
               <w:right w:val="single" w:color="D9D3E3" w:sz="4"/>
             </w:tcBorders>
-            <w:shd w:fill="E9F0FA" w:color="auto" w:val="clear"/>
+            <w:shd w:fill="E8F0F8" w:color="auto" w:val="clear"/>
             <w:tcMar>
               <w:top w:type="dxa" w:w="80"/>
               <w:left w:type="dxa" w:w="120"/>
@@ -1438,7 +1484,7 @@
               <w:bottom w:val="single" w:color="D9D3E3" w:sz="4"/>
               <w:right w:val="single" w:color="D9D3E3" w:sz="4"/>
             </w:tcBorders>
-            <w:shd w:fill="E9F0FA" w:color="auto" w:val="clear"/>
+            <w:shd w:fill="E8F0F8" w:color="auto" w:val="clear"/>
             <w:tcMar>
               <w:top w:type="dxa" w:w="80"/>
               <w:left w:type="dxa" w:w="120"/>
@@ -1471,7 +1517,7 @@
               <w:bottom w:val="single" w:color="D9D3E3" w:sz="4"/>
               <w:right w:val="single" w:color="D9D3E3" w:sz="4"/>
             </w:tcBorders>
-            <w:shd w:fill="E9F0FA" w:color="auto" w:val="clear"/>
+            <w:shd w:fill="E8F0F8" w:color="auto" w:val="clear"/>
             <w:tcMar>
               <w:top w:type="dxa" w:w="80"/>
               <w:left w:type="dxa" w:w="120"/>
@@ -1513,7 +1559,7 @@
           <w:rFonts w:ascii="Calibri" w:cs="Calibri" w:eastAsia="Calibri" w:hAnsi="Calibri"/>
           <w:b/>
           <w:bCs/>
-          <w:color w:val="00338D"/>
+          <w:color w:val="00529B"/>
           <w:sz w:val="24"/>
           <w:szCs w:val="24"/>
         </w:rPr>
@@ -1544,11 +1590,11 @@
             <w:tcW w:type="pct" w:w="100%"/>
             <w:tcBorders>
               <w:top w:val="single" w:color="D9D3E3" w:sz="4"/>
-              <w:left w:val="single" w:color="FDB913" w:sz="24"/>
-              <w:bottom w:val="single" w:color="D9D3E3" w:sz="4"/>
-              <w:right w:val="single" w:color="D9D3E3" w:sz="4"/>
-            </w:tcBorders>
-            <w:shd w:fill="FFF6DF" w:color="auto" w:val="clear"/>
+              <w:left w:val="single" w:color="8C7200" w:sz="24"/>
+              <w:bottom w:val="single" w:color="D9D3E3" w:sz="4"/>
+              <w:right w:val="single" w:color="D9D3E3" w:sz="4"/>
+            </w:tcBorders>
+            <w:shd w:fill="FFF7DD" w:color="auto" w:val="clear"/>
             <w:tcMar>
               <w:top w:type="dxa" w:w="160"/>
               <w:left w:type="dxa" w:w="220"/>
@@ -1565,7 +1611,7 @@
                 <w:rFonts w:ascii="Calibri" w:cs="Calibri" w:eastAsia="Calibri" w:hAnsi="Calibri"/>
                 <w:b/>
                 <w:bCs/>
-                <w:color w:val="FDB913"/>
+                <w:color w:val="8C7200"/>
                 <w:sz w:val="20"/>
                 <w:szCs w:val="20"/>
               </w:rPr>
@@ -1594,7 +1640,7 @@
         <w:pStyle w:val="Heading1"/>
         <w:keepNext/>
         <w:pBdr>
-          <w:bottom w:val="single" w:color="FDB913" w:sz="8" w:space="6"/>
+          <w:bottom w:val="single" w:color="FFCF00" w:sz="8" w:space="6"/>
         </w:pBdr>
         <w:spacing w:after="200" w:before="480"/>
       </w:pPr>
@@ -1603,7 +1649,7 @@
           <w:rFonts w:ascii="Calibri" w:cs="Calibri" w:eastAsia="Calibri" w:hAnsi="Calibri"/>
           <w:b/>
           <w:bCs/>
-          <w:color w:val="FDB913"/>
+          <w:color w:val="8C7200"/>
           <w:sz w:val="30"/>
           <w:szCs w:val="30"/>
         </w:rPr>
@@ -1614,7 +1660,7 @@
           <w:rFonts w:ascii="Calibri" w:cs="Calibri" w:eastAsia="Calibri" w:hAnsi="Calibri"/>
           <w:b/>
           <w:bCs/>
-          <w:color w:val="001F54"/>
+          <w:color w:val="002D55"/>
           <w:sz w:val="30"/>
           <w:szCs w:val="30"/>
         </w:rPr>
@@ -1646,7 +1692,7 @@
           <w:rFonts w:ascii="Calibri" w:cs="Calibri" w:eastAsia="Calibri" w:hAnsi="Calibri"/>
           <w:b/>
           <w:bCs/>
-          <w:color w:val="00338D"/>
+          <w:color w:val="00529B"/>
           <w:sz w:val="24"/>
           <w:szCs w:val="24"/>
         </w:rPr>
@@ -1740,7 +1786,7 @@
           <w:rFonts w:ascii="Calibri" w:cs="Calibri" w:eastAsia="Calibri" w:hAnsi="Calibri"/>
           <w:b/>
           <w:bCs/>
-          <w:color w:val="00338D"/>
+          <w:color w:val="00529B"/>
           <w:sz w:val="24"/>
           <w:szCs w:val="24"/>
         </w:rPr>
@@ -1834,7 +1880,7 @@
           <w:rFonts w:ascii="Calibri" w:cs="Calibri" w:eastAsia="Calibri" w:hAnsi="Calibri"/>
           <w:b/>
           <w:bCs/>
-          <w:color w:val="00338D"/>
+          <w:color w:val="00529B"/>
           <w:sz w:val="24"/>
           <w:szCs w:val="24"/>
         </w:rPr>
@@ -1860,7 +1906,7 @@
         <w:pStyle w:val="Heading1"/>
         <w:keepNext/>
         <w:pBdr>
-          <w:bottom w:val="single" w:color="FDB913" w:sz="8" w:space="6"/>
+          <w:bottom w:val="single" w:color="FFCF00" w:sz="8" w:space="6"/>
         </w:pBdr>
         <w:spacing w:after="200" w:before="480"/>
       </w:pPr>
@@ -1869,7 +1915,7 @@
           <w:rFonts w:ascii="Calibri" w:cs="Calibri" w:eastAsia="Calibri" w:hAnsi="Calibri"/>
           <w:b/>
           <w:bCs/>
-          <w:color w:val="FDB913"/>
+          <w:color w:val="8C7200"/>
           <w:sz w:val="30"/>
           <w:szCs w:val="30"/>
         </w:rPr>
@@ -1880,7 +1926,7 @@
           <w:rFonts w:ascii="Calibri" w:cs="Calibri" w:eastAsia="Calibri" w:hAnsi="Calibri"/>
           <w:b/>
           <w:bCs/>
-          <w:color w:val="001F54"/>
+          <w:color w:val="002D55"/>
           <w:sz w:val="30"/>
           <w:szCs w:val="30"/>
         </w:rPr>
@@ -1911,11 +1957,11 @@
             <w:tcW w:type="pct" w:w="100%"/>
             <w:tcBorders>
               <w:top w:val="single" w:color="D9D3E3" w:sz="4"/>
-              <w:left w:val="single" w:color="00338D" w:sz="24"/>
-              <w:bottom w:val="single" w:color="D9D3E3" w:sz="4"/>
-              <w:right w:val="single" w:color="D9D3E3" w:sz="4"/>
-            </w:tcBorders>
-            <w:shd w:fill="E9F0FA" w:color="auto" w:val="clear"/>
+              <w:left w:val="single" w:color="00529B" w:sz="24"/>
+              <w:bottom w:val="single" w:color="D9D3E3" w:sz="4"/>
+              <w:right w:val="single" w:color="D9D3E3" w:sz="4"/>
+            </w:tcBorders>
+            <w:shd w:fill="E8F0F8" w:color="auto" w:val="clear"/>
             <w:tcMar>
               <w:top w:type="dxa" w:w="160"/>
               <w:left w:type="dxa" w:w="220"/>
@@ -1932,7 +1978,7 @@
                 <w:rFonts w:ascii="Calibri" w:cs="Calibri" w:eastAsia="Calibri" w:hAnsi="Calibri"/>
                 <w:b/>
                 <w:bCs/>
-                <w:color w:val="00338D"/>
+                <w:color w:val="00529B"/>
                 <w:sz w:val="20"/>
                 <w:szCs w:val="20"/>
               </w:rPr>
@@ -1972,7 +2018,7 @@
           <w:rFonts w:ascii="Calibri" w:cs="Calibri" w:eastAsia="Calibri" w:hAnsi="Calibri"/>
           <w:b/>
           <w:bCs/>
-          <w:color w:val="00338D"/>
+          <w:color w:val="00529B"/>
           <w:sz w:val="24"/>
           <w:szCs w:val="24"/>
         </w:rPr>
@@ -2012,7 +2058,7 @@
               <w:bottom w:val="single" w:color="D9D3E3" w:sz="4"/>
               <w:right w:val="single" w:color="D9D3E3" w:sz="4"/>
             </w:tcBorders>
-            <w:shd w:fill="00338D" w:color="auto" w:val="clear"/>
+            <w:shd w:fill="00529B" w:color="auto" w:val="clear"/>
             <w:tcMar>
               <w:top w:type="dxa" w:w="90"/>
               <w:left w:type="dxa" w:w="120"/>
@@ -2047,7 +2093,7 @@
               <w:bottom w:val="single" w:color="D9D3E3" w:sz="4"/>
               <w:right w:val="single" w:color="D9D3E3" w:sz="4"/>
             </w:tcBorders>
-            <w:shd w:fill="00338D" w:color="auto" w:val="clear"/>
+            <w:shd w:fill="00529B" w:color="auto" w:val="clear"/>
             <w:tcMar>
               <w:top w:type="dxa" w:w="90"/>
               <w:left w:type="dxa" w:w="120"/>
@@ -2082,7 +2128,7 @@
               <w:bottom w:val="single" w:color="D9D3E3" w:sz="4"/>
               <w:right w:val="single" w:color="D9D3E3" w:sz="4"/>
             </w:tcBorders>
-            <w:shd w:fill="00338D" w:color="auto" w:val="clear"/>
+            <w:shd w:fill="00529B" w:color="auto" w:val="clear"/>
             <w:tcMar>
               <w:top w:type="dxa" w:w="90"/>
               <w:left w:type="dxa" w:w="120"/>
@@ -2117,7 +2163,7 @@
               <w:bottom w:val="single" w:color="D9D3E3" w:sz="4"/>
               <w:right w:val="single" w:color="D9D3E3" w:sz="4"/>
             </w:tcBorders>
-            <w:shd w:fill="00338D" w:color="auto" w:val="clear"/>
+            <w:shd w:fill="00529B" w:color="auto" w:val="clear"/>
             <w:tcMar>
               <w:top w:type="dxa" w:w="90"/>
               <w:left w:type="dxa" w:w="120"/>
@@ -2152,7 +2198,7 @@
               <w:bottom w:val="single" w:color="D9D3E3" w:sz="4"/>
               <w:right w:val="single" w:color="D9D3E3" w:sz="4"/>
             </w:tcBorders>
-            <w:shd w:fill="00338D" w:color="auto" w:val="clear"/>
+            <w:shd w:fill="00529B" w:color="auto" w:val="clear"/>
             <w:tcMar>
               <w:top w:type="dxa" w:w="90"/>
               <w:left w:type="dxa" w:w="120"/>
@@ -2362,7 +2408,7 @@
               <w:bottom w:val="single" w:color="D9D3E3" w:sz="4"/>
               <w:right w:val="single" w:color="D9D3E3" w:sz="4"/>
             </w:tcBorders>
-            <w:shd w:fill="E9F0FA" w:color="auto" w:val="clear"/>
+            <w:shd w:fill="E8F0F8" w:color="auto" w:val="clear"/>
             <w:tcMar>
               <w:top w:type="dxa" w:w="80"/>
               <w:left w:type="dxa" w:w="120"/>
@@ -2395,7 +2441,7 @@
               <w:bottom w:val="single" w:color="D9D3E3" w:sz="4"/>
               <w:right w:val="single" w:color="D9D3E3" w:sz="4"/>
             </w:tcBorders>
-            <w:shd w:fill="E9F0FA" w:color="auto" w:val="clear"/>
+            <w:shd w:fill="E8F0F8" w:color="auto" w:val="clear"/>
             <w:tcMar>
               <w:top w:type="dxa" w:w="80"/>
               <w:left w:type="dxa" w:w="120"/>
@@ -2428,7 +2474,7 @@
               <w:bottom w:val="single" w:color="D9D3E3" w:sz="4"/>
               <w:right w:val="single" w:color="D9D3E3" w:sz="4"/>
             </w:tcBorders>
-            <w:shd w:fill="E9F0FA" w:color="auto" w:val="clear"/>
+            <w:shd w:fill="E8F0F8" w:color="auto" w:val="clear"/>
             <w:tcMar>
               <w:top w:type="dxa" w:w="80"/>
               <w:left w:type="dxa" w:w="120"/>
@@ -2461,7 +2507,7 @@
               <w:bottom w:val="single" w:color="D9D3E3" w:sz="4"/>
               <w:right w:val="single" w:color="D9D3E3" w:sz="4"/>
             </w:tcBorders>
-            <w:shd w:fill="E9F0FA" w:color="auto" w:val="clear"/>
+            <w:shd w:fill="E8F0F8" w:color="auto" w:val="clear"/>
             <w:tcMar>
               <w:top w:type="dxa" w:w="80"/>
               <w:left w:type="dxa" w:w="120"/>
@@ -2494,7 +2540,7 @@
               <w:bottom w:val="single" w:color="D9D3E3" w:sz="4"/>
               <w:right w:val="single" w:color="D9D3E3" w:sz="4"/>
             </w:tcBorders>
-            <w:shd w:fill="E9F0FA" w:color="auto" w:val="clear"/>
+            <w:shd w:fill="E8F0F8" w:color="auto" w:val="clear"/>
             <w:tcMar>
               <w:top w:type="dxa" w:w="80"/>
               <w:left w:type="dxa" w:w="120"/>
@@ -2715,7 +2761,7 @@
           <w:rFonts w:ascii="Calibri" w:cs="Calibri" w:eastAsia="Calibri" w:hAnsi="Calibri"/>
           <w:b/>
           <w:bCs/>
-          <w:color w:val="00338D"/>
+          <w:color w:val="00529B"/>
           <w:sz w:val="24"/>
           <w:szCs w:val="24"/>
         </w:rPr>
@@ -2768,7 +2814,7 @@
               <w:bottom w:val="single" w:color="D9D3E3" w:sz="4"/>
               <w:right w:val="single" w:color="D9D3E3" w:sz="4"/>
             </w:tcBorders>
-            <w:shd w:fill="00338D" w:color="auto" w:val="clear"/>
+            <w:shd w:fill="00529B" w:color="auto" w:val="clear"/>
             <w:tcMar>
               <w:top w:type="dxa" w:w="90"/>
               <w:left w:type="dxa" w:w="120"/>
@@ -2803,7 +2849,7 @@
               <w:bottom w:val="single" w:color="D9D3E3" w:sz="4"/>
               <w:right w:val="single" w:color="D9D3E3" w:sz="4"/>
             </w:tcBorders>
-            <w:shd w:fill="00338D" w:color="auto" w:val="clear"/>
+            <w:shd w:fill="00529B" w:color="auto" w:val="clear"/>
             <w:tcMar>
               <w:top w:type="dxa" w:w="90"/>
               <w:left w:type="dxa" w:w="120"/>
@@ -2838,7 +2884,7 @@
               <w:bottom w:val="single" w:color="D9D3E3" w:sz="4"/>
               <w:right w:val="single" w:color="D9D3E3" w:sz="4"/>
             </w:tcBorders>
-            <w:shd w:fill="00338D" w:color="auto" w:val="clear"/>
+            <w:shd w:fill="00529B" w:color="auto" w:val="clear"/>
             <w:tcMar>
               <w:top w:type="dxa" w:w="90"/>
               <w:left w:type="dxa" w:w="120"/>
@@ -2873,7 +2919,7 @@
               <w:bottom w:val="single" w:color="D9D3E3" w:sz="4"/>
               <w:right w:val="single" w:color="D9D3E3" w:sz="4"/>
             </w:tcBorders>
-            <w:shd w:fill="00338D" w:color="auto" w:val="clear"/>
+            <w:shd w:fill="00529B" w:color="auto" w:val="clear"/>
             <w:tcMar>
               <w:top w:type="dxa" w:w="90"/>
               <w:left w:type="dxa" w:w="120"/>
@@ -3050,7 +3096,7 @@
               <w:bottom w:val="single" w:color="D9D3E3" w:sz="4"/>
               <w:right w:val="single" w:color="D9D3E3" w:sz="4"/>
             </w:tcBorders>
-            <w:shd w:fill="E9F0FA" w:color="auto" w:val="clear"/>
+            <w:shd w:fill="E8F0F8" w:color="auto" w:val="clear"/>
             <w:tcMar>
               <w:top w:type="dxa" w:w="80"/>
               <w:left w:type="dxa" w:w="120"/>
@@ -3083,7 +3129,7 @@
               <w:bottom w:val="single" w:color="D9D3E3" w:sz="4"/>
               <w:right w:val="single" w:color="D9D3E3" w:sz="4"/>
             </w:tcBorders>
-            <w:shd w:fill="E9F0FA" w:color="auto" w:val="clear"/>
+            <w:shd w:fill="E8F0F8" w:color="auto" w:val="clear"/>
             <w:tcMar>
               <w:top w:type="dxa" w:w="80"/>
               <w:left w:type="dxa" w:w="120"/>
@@ -3116,7 +3162,7 @@
               <w:bottom w:val="single" w:color="D9D3E3" w:sz="4"/>
               <w:right w:val="single" w:color="D9D3E3" w:sz="4"/>
             </w:tcBorders>
-            <w:shd w:fill="E9F0FA" w:color="auto" w:val="clear"/>
+            <w:shd w:fill="E8F0F8" w:color="auto" w:val="clear"/>
             <w:tcMar>
               <w:top w:type="dxa" w:w="80"/>
               <w:left w:type="dxa" w:w="120"/>
@@ -3149,7 +3195,7 @@
               <w:bottom w:val="single" w:color="D9D3E3" w:sz="4"/>
               <w:right w:val="single" w:color="D9D3E3" w:sz="4"/>
             </w:tcBorders>
-            <w:shd w:fill="E9F0FA" w:color="auto" w:val="clear"/>
+            <w:shd w:fill="E8F0F8" w:color="auto" w:val="clear"/>
             <w:tcMar>
               <w:top w:type="dxa" w:w="80"/>
               <w:left w:type="dxa" w:w="120"/>
@@ -3191,7 +3237,7 @@
           <w:rFonts w:ascii="Calibri" w:cs="Calibri" w:eastAsia="Calibri" w:hAnsi="Calibri"/>
           <w:b/>
           <w:bCs/>
-          <w:color w:val="00338D"/>
+          <w:color w:val="00529B"/>
           <w:sz w:val="24"/>
           <w:szCs w:val="24"/>
         </w:rPr>
@@ -3229,7 +3275,7 @@
               <w:bottom w:val="single" w:color="D9D3E3" w:sz="4"/>
               <w:right w:val="single" w:color="D9D3E3" w:sz="4"/>
             </w:tcBorders>
-            <w:shd w:fill="00338D" w:color="auto" w:val="clear"/>
+            <w:shd w:fill="00529B" w:color="auto" w:val="clear"/>
             <w:tcMar>
               <w:top w:type="dxa" w:w="90"/>
               <w:left w:type="dxa" w:w="120"/>
@@ -3264,7 +3310,7 @@
               <w:bottom w:val="single" w:color="D9D3E3" w:sz="4"/>
               <w:right w:val="single" w:color="D9D3E3" w:sz="4"/>
             </w:tcBorders>
-            <w:shd w:fill="00338D" w:color="auto" w:val="clear"/>
+            <w:shd w:fill="00529B" w:color="auto" w:val="clear"/>
             <w:tcMar>
               <w:top w:type="dxa" w:w="90"/>
               <w:left w:type="dxa" w:w="120"/>
@@ -3299,7 +3345,7 @@
               <w:bottom w:val="single" w:color="D9D3E3" w:sz="4"/>
               <w:right w:val="single" w:color="D9D3E3" w:sz="4"/>
             </w:tcBorders>
-            <w:shd w:fill="00338D" w:color="auto" w:val="clear"/>
+            <w:shd w:fill="00529B" w:color="auto" w:val="clear"/>
             <w:tcMar>
               <w:top w:type="dxa" w:w="90"/>
               <w:left w:type="dxa" w:w="120"/>
@@ -3443,7 +3489,7 @@
               <w:bottom w:val="single" w:color="D9D3E3" w:sz="4"/>
               <w:right w:val="single" w:color="D9D3E3" w:sz="4"/>
             </w:tcBorders>
-            <w:shd w:fill="E9F0FA" w:color="auto" w:val="clear"/>
+            <w:shd w:fill="E8F0F8" w:color="auto" w:val="clear"/>
             <w:tcMar>
               <w:top w:type="dxa" w:w="80"/>
               <w:left w:type="dxa" w:w="120"/>
@@ -3476,7 +3522,7 @@
               <w:bottom w:val="single" w:color="D9D3E3" w:sz="4"/>
               <w:right w:val="single" w:color="D9D3E3" w:sz="4"/>
             </w:tcBorders>
-            <w:shd w:fill="E9F0FA" w:color="auto" w:val="clear"/>
+            <w:shd w:fill="E8F0F8" w:color="auto" w:val="clear"/>
             <w:tcMar>
               <w:top w:type="dxa" w:w="80"/>
               <w:left w:type="dxa" w:w="120"/>
@@ -3509,7 +3555,7 @@
               <w:bottom w:val="single" w:color="D9D3E3" w:sz="4"/>
               <w:right w:val="single" w:color="D9D3E3" w:sz="4"/>
             </w:tcBorders>
-            <w:shd w:fill="E9F0FA" w:color="auto" w:val="clear"/>
+            <w:shd w:fill="E8F0F8" w:color="auto" w:val="clear"/>
             <w:tcMar>
               <w:top w:type="dxa" w:w="80"/>
               <w:left w:type="dxa" w:w="120"/>
@@ -3651,7 +3697,7 @@
               <w:bottom w:val="single" w:color="D9D3E3" w:sz="4"/>
               <w:right w:val="single" w:color="D9D3E3" w:sz="4"/>
             </w:tcBorders>
-            <w:shd w:fill="E9F0FA" w:color="auto" w:val="clear"/>
+            <w:shd w:fill="E8F0F8" w:color="auto" w:val="clear"/>
             <w:tcMar>
               <w:top w:type="dxa" w:w="80"/>
               <w:left w:type="dxa" w:w="120"/>
@@ -3684,7 +3730,7 @@
               <w:bottom w:val="single" w:color="D9D3E3" w:sz="4"/>
               <w:right w:val="single" w:color="D9D3E3" w:sz="4"/>
             </w:tcBorders>
-            <w:shd w:fill="E9F0FA" w:color="auto" w:val="clear"/>
+            <w:shd w:fill="E8F0F8" w:color="auto" w:val="clear"/>
             <w:tcMar>
               <w:top w:type="dxa" w:w="80"/>
               <w:left w:type="dxa" w:w="120"/>
@@ -3717,7 +3763,7 @@
               <w:bottom w:val="single" w:color="D9D3E3" w:sz="4"/>
               <w:right w:val="single" w:color="D9D3E3" w:sz="4"/>
             </w:tcBorders>
-            <w:shd w:fill="E9F0FA" w:color="auto" w:val="clear"/>
+            <w:shd w:fill="E8F0F8" w:color="auto" w:val="clear"/>
             <w:tcMar>
               <w:top w:type="dxa" w:w="80"/>
               <w:left w:type="dxa" w:w="120"/>
@@ -3863,7 +3909,7 @@
           <w:rFonts w:ascii="Calibri" w:cs="Calibri" w:eastAsia="Calibri" w:hAnsi="Calibri"/>
           <w:b/>
           <w:bCs/>
-          <w:color w:val="00338D"/>
+          <w:color w:val="00529B"/>
           <w:sz w:val="24"/>
           <w:szCs w:val="24"/>
         </w:rPr>
@@ -3915,7 +3961,7 @@
               <w:bottom w:val="single" w:color="D9D3E3" w:sz="4"/>
               <w:right w:val="single" w:color="D9D3E3" w:sz="4"/>
             </w:tcBorders>
-            <w:shd w:fill="00338D" w:color="auto" w:val="clear"/>
+            <w:shd w:fill="00529B" w:color="auto" w:val="clear"/>
             <w:tcMar>
               <w:top w:type="dxa" w:w="90"/>
               <w:left w:type="dxa" w:w="120"/>
@@ -3950,7 +3996,7 @@
               <w:bottom w:val="single" w:color="D9D3E3" w:sz="4"/>
               <w:right w:val="single" w:color="D9D3E3" w:sz="4"/>
             </w:tcBorders>
-            <w:shd w:fill="00338D" w:color="auto" w:val="clear"/>
+            <w:shd w:fill="00529B" w:color="auto" w:val="clear"/>
             <w:tcMar>
               <w:top w:type="dxa" w:w="90"/>
               <w:left w:type="dxa" w:w="120"/>
@@ -3985,7 +4031,7 @@
               <w:bottom w:val="single" w:color="D9D3E3" w:sz="4"/>
               <w:right w:val="single" w:color="D9D3E3" w:sz="4"/>
             </w:tcBorders>
-            <w:shd w:fill="00338D" w:color="auto" w:val="clear"/>
+            <w:shd w:fill="00529B" w:color="auto" w:val="clear"/>
             <w:tcMar>
               <w:top w:type="dxa" w:w="90"/>
               <w:left w:type="dxa" w:w="120"/>
@@ -4129,7 +4175,7 @@
               <w:bottom w:val="single" w:color="D9D3E3" w:sz="4"/>
               <w:right w:val="single" w:color="D9D3E3" w:sz="4"/>
             </w:tcBorders>
-            <w:shd w:fill="E9F0FA" w:color="auto" w:val="clear"/>
+            <w:shd w:fill="E8F0F8" w:color="auto" w:val="clear"/>
             <w:tcMar>
               <w:top w:type="dxa" w:w="80"/>
               <w:left w:type="dxa" w:w="120"/>
@@ -4162,7 +4208,7 @@
               <w:bottom w:val="single" w:color="D9D3E3" w:sz="4"/>
               <w:right w:val="single" w:color="D9D3E3" w:sz="4"/>
             </w:tcBorders>
-            <w:shd w:fill="E9F0FA" w:color="auto" w:val="clear"/>
+            <w:shd w:fill="E8F0F8" w:color="auto" w:val="clear"/>
             <w:tcMar>
               <w:top w:type="dxa" w:w="80"/>
               <w:left w:type="dxa" w:w="120"/>
@@ -4195,7 +4241,7 @@
               <w:bottom w:val="single" w:color="D9D3E3" w:sz="4"/>
               <w:right w:val="single" w:color="D9D3E3" w:sz="4"/>
             </w:tcBorders>
-            <w:shd w:fill="E9F0FA" w:color="auto" w:val="clear"/>
+            <w:shd w:fill="E8F0F8" w:color="auto" w:val="clear"/>
             <w:tcMar>
               <w:top w:type="dxa" w:w="80"/>
               <w:left w:type="dxa" w:w="120"/>
@@ -4337,7 +4383,7 @@
               <w:bottom w:val="single" w:color="D9D3E3" w:sz="4"/>
               <w:right w:val="single" w:color="D9D3E3" w:sz="4"/>
             </w:tcBorders>
-            <w:shd w:fill="E9F0FA" w:color="auto" w:val="clear"/>
+            <w:shd w:fill="E8F0F8" w:color="auto" w:val="clear"/>
             <w:tcMar>
               <w:top w:type="dxa" w:w="80"/>
               <w:left w:type="dxa" w:w="120"/>
@@ -4370,7 +4416,7 @@
               <w:bottom w:val="single" w:color="D9D3E3" w:sz="4"/>
               <w:right w:val="single" w:color="D9D3E3" w:sz="4"/>
             </w:tcBorders>
-            <w:shd w:fill="E9F0FA" w:color="auto" w:val="clear"/>
+            <w:shd w:fill="E8F0F8" w:color="auto" w:val="clear"/>
             <w:tcMar>
               <w:top w:type="dxa" w:w="80"/>
               <w:left w:type="dxa" w:w="120"/>
@@ -4403,7 +4449,7 @@
               <w:bottom w:val="single" w:color="D9D3E3" w:sz="4"/>
               <w:right w:val="single" w:color="D9D3E3" w:sz="4"/>
             </w:tcBorders>
-            <w:shd w:fill="E9F0FA" w:color="auto" w:val="clear"/>
+            <w:shd w:fill="E8F0F8" w:color="auto" w:val="clear"/>
             <w:tcMar>
               <w:top w:type="dxa" w:w="80"/>
               <w:left w:type="dxa" w:w="120"/>
@@ -4562,11 +4608,11 @@
             <w:tcW w:type="pct" w:w="100%"/>
             <w:tcBorders>
               <w:top w:val="single" w:color="D9D3E3" w:sz="4"/>
-              <w:left w:val="single" w:color="FDB913" w:sz="24"/>
-              <w:bottom w:val="single" w:color="D9D3E3" w:sz="4"/>
-              <w:right w:val="single" w:color="D9D3E3" w:sz="4"/>
-            </w:tcBorders>
-            <w:shd w:fill="FFF6DF" w:color="auto" w:val="clear"/>
+              <w:left w:val="single" w:color="8C7200" w:sz="24"/>
+              <w:bottom w:val="single" w:color="D9D3E3" w:sz="4"/>
+              <w:right w:val="single" w:color="D9D3E3" w:sz="4"/>
+            </w:tcBorders>
+            <w:shd w:fill="FFF7DD" w:color="auto" w:val="clear"/>
             <w:tcMar>
               <w:top w:type="dxa" w:w="160"/>
               <w:left w:type="dxa" w:w="220"/>
@@ -4583,7 +4629,7 @@
                 <w:rFonts w:ascii="Calibri" w:cs="Calibri" w:eastAsia="Calibri" w:hAnsi="Calibri"/>
                 <w:b/>
                 <w:bCs/>
-                <w:color w:val="FDB913"/>
+                <w:color w:val="8C7200"/>
                 <w:sz w:val="20"/>
                 <w:szCs w:val="20"/>
               </w:rPr>
@@ -4612,7 +4658,7 @@
         <w:pStyle w:val="Heading1"/>
         <w:keepNext/>
         <w:pBdr>
-          <w:bottom w:val="single" w:color="FDB913" w:sz="8" w:space="6"/>
+          <w:bottom w:val="single" w:color="FFCF00" w:sz="8" w:space="6"/>
         </w:pBdr>
         <w:spacing w:after="200" w:before="480"/>
       </w:pPr>
@@ -4621,7 +4667,7 @@
           <w:rFonts w:ascii="Calibri" w:cs="Calibri" w:eastAsia="Calibri" w:hAnsi="Calibri"/>
           <w:b/>
           <w:bCs/>
-          <w:color w:val="FDB913"/>
+          <w:color w:val="8C7200"/>
           <w:sz w:val="30"/>
           <w:szCs w:val="30"/>
         </w:rPr>
@@ -4632,7 +4678,7 @@
           <w:rFonts w:ascii="Calibri" w:cs="Calibri" w:eastAsia="Calibri" w:hAnsi="Calibri"/>
           <w:b/>
           <w:bCs/>
-          <w:color w:val="001F54"/>
+          <w:color w:val="002D55"/>
           <w:sz w:val="30"/>
           <w:szCs w:val="30"/>
         </w:rPr>
@@ -4650,7 +4696,7 @@
           <w:rFonts w:ascii="Calibri" w:cs="Calibri" w:eastAsia="Calibri" w:hAnsi="Calibri"/>
           <w:b/>
           <w:bCs/>
-          <w:color w:val="00338D"/>
+          <w:color w:val="00529B"/>
           <w:sz w:val="24"/>
           <w:szCs w:val="24"/>
         </w:rPr>
@@ -4744,7 +4790,7 @@
           <w:rFonts w:ascii="Calibri" w:cs="Calibri" w:eastAsia="Calibri" w:hAnsi="Calibri"/>
           <w:b/>
           <w:bCs/>
-          <w:color w:val="00338D"/>
+          <w:color w:val="00529B"/>
           <w:sz w:val="24"/>
           <w:szCs w:val="24"/>
         </w:rPr>
@@ -4838,7 +4884,7 @@
           <w:rFonts w:ascii="Calibri" w:cs="Calibri" w:eastAsia="Calibri" w:hAnsi="Calibri"/>
           <w:b/>
           <w:bCs/>
-          <w:color w:val="00338D"/>
+          <w:color w:val="00529B"/>
           <w:sz w:val="24"/>
           <w:szCs w:val="24"/>
         </w:rPr>
@@ -4889,7 +4935,7 @@
               <w:bottom w:val="single" w:color="D9D3E3" w:sz="4"/>
               <w:right w:val="single" w:color="D9D3E3" w:sz="4"/>
             </w:tcBorders>
-            <w:shd w:fill="00338D" w:color="auto" w:val="clear"/>
+            <w:shd w:fill="00529B" w:color="auto" w:val="clear"/>
             <w:tcMar>
               <w:top w:type="dxa" w:w="90"/>
               <w:left w:type="dxa" w:w="120"/>
@@ -4924,7 +4970,7 @@
               <w:bottom w:val="single" w:color="D9D3E3" w:sz="4"/>
               <w:right w:val="single" w:color="D9D3E3" w:sz="4"/>
             </w:tcBorders>
-            <w:shd w:fill="00338D" w:color="auto" w:val="clear"/>
+            <w:shd w:fill="00529B" w:color="auto" w:val="clear"/>
             <w:tcMar>
               <w:top w:type="dxa" w:w="90"/>
               <w:left w:type="dxa" w:w="120"/>
@@ -5035,7 +5081,7 @@
               <w:bottom w:val="single" w:color="D9D3E3" w:sz="4"/>
               <w:right w:val="single" w:color="D9D3E3" w:sz="4"/>
             </w:tcBorders>
-            <w:shd w:fill="E9F0FA" w:color="auto" w:val="clear"/>
+            <w:shd w:fill="E8F0F8" w:color="auto" w:val="clear"/>
             <w:tcMar>
               <w:top w:type="dxa" w:w="80"/>
               <w:left w:type="dxa" w:w="120"/>
@@ -5068,7 +5114,7 @@
               <w:bottom w:val="single" w:color="D9D3E3" w:sz="4"/>
               <w:right w:val="single" w:color="D9D3E3" w:sz="4"/>
             </w:tcBorders>
-            <w:shd w:fill="E9F0FA" w:color="auto" w:val="clear"/>
+            <w:shd w:fill="E8F0F8" w:color="auto" w:val="clear"/>
             <w:tcMar>
               <w:top w:type="dxa" w:w="80"/>
               <w:left w:type="dxa" w:w="120"/>
@@ -5177,7 +5223,7 @@
               <w:bottom w:val="single" w:color="D9D3E3" w:sz="4"/>
               <w:right w:val="single" w:color="D9D3E3" w:sz="4"/>
             </w:tcBorders>
-            <w:shd w:fill="E9F0FA" w:color="auto" w:val="clear"/>
+            <w:shd w:fill="E8F0F8" w:color="auto" w:val="clear"/>
             <w:tcMar>
               <w:top w:type="dxa" w:w="80"/>
               <w:left w:type="dxa" w:w="120"/>
@@ -5210,7 +5256,7 @@
               <w:bottom w:val="single" w:color="D9D3E3" w:sz="4"/>
               <w:right w:val="single" w:color="D9D3E3" w:sz="4"/>
             </w:tcBorders>
-            <w:shd w:fill="E9F0FA" w:color="auto" w:val="clear"/>
+            <w:shd w:fill="E8F0F8" w:color="auto" w:val="clear"/>
             <w:tcMar>
               <w:top w:type="dxa" w:w="80"/>
               <w:left w:type="dxa" w:w="120"/>
@@ -5374,7 +5420,7 @@
         <w:pStyle w:val="Heading1"/>
         <w:keepNext/>
         <w:pBdr>
-          <w:bottom w:val="single" w:color="FDB913" w:sz="8" w:space="6"/>
+          <w:bottom w:val="single" w:color="FFCF00" w:sz="8" w:space="6"/>
         </w:pBdr>
         <w:spacing w:after="200" w:before="480"/>
       </w:pPr>
@@ -5383,7 +5429,7 @@
           <w:rFonts w:ascii="Calibri" w:cs="Calibri" w:eastAsia="Calibri" w:hAnsi="Calibri"/>
           <w:b/>
           <w:bCs/>
-          <w:color w:val="FDB913"/>
+          <w:color w:val="8C7200"/>
           <w:sz w:val="30"/>
           <w:szCs w:val="30"/>
         </w:rPr>
@@ -5394,7 +5440,7 @@
           <w:rFonts w:ascii="Calibri" w:cs="Calibri" w:eastAsia="Calibri" w:hAnsi="Calibri"/>
           <w:b/>
           <w:bCs/>
-          <w:color w:val="001F54"/>
+          <w:color w:val="002D55"/>
           <w:sz w:val="30"/>
           <w:szCs w:val="30"/>
         </w:rPr>
@@ -5412,7 +5458,7 @@
           <w:rFonts w:ascii="Calibri" w:cs="Calibri" w:eastAsia="Calibri" w:hAnsi="Calibri"/>
           <w:b/>
           <w:bCs/>
-          <w:color w:val="00338D"/>
+          <w:color w:val="00529B"/>
           <w:sz w:val="24"/>
           <w:szCs w:val="24"/>
         </w:rPr>
@@ -5450,7 +5496,7 @@
               <w:bottom w:val="single" w:color="D9D3E3" w:sz="4"/>
               <w:right w:val="single" w:color="D9D3E3" w:sz="4"/>
             </w:tcBorders>
-            <w:shd w:fill="00338D" w:color="auto" w:val="clear"/>
+            <w:shd w:fill="00529B" w:color="auto" w:val="clear"/>
             <w:tcMar>
               <w:top w:type="dxa" w:w="90"/>
               <w:left w:type="dxa" w:w="120"/>
@@ -5485,7 +5531,7 @@
               <w:bottom w:val="single" w:color="D9D3E3" w:sz="4"/>
               <w:right w:val="single" w:color="D9D3E3" w:sz="4"/>
             </w:tcBorders>
-            <w:shd w:fill="00338D" w:color="auto" w:val="clear"/>
+            <w:shd w:fill="00529B" w:color="auto" w:val="clear"/>
             <w:tcMar>
               <w:top w:type="dxa" w:w="90"/>
               <w:left w:type="dxa" w:w="120"/>
@@ -5520,7 +5566,7 @@
               <w:bottom w:val="single" w:color="D9D3E3" w:sz="4"/>
               <w:right w:val="single" w:color="D9D3E3" w:sz="4"/>
             </w:tcBorders>
-            <w:shd w:fill="00338D" w:color="auto" w:val="clear"/>
+            <w:shd w:fill="00529B" w:color="auto" w:val="clear"/>
             <w:tcMar>
               <w:top w:type="dxa" w:w="90"/>
               <w:left w:type="dxa" w:w="120"/>
@@ -5664,7 +5710,7 @@
               <w:bottom w:val="single" w:color="D9D3E3" w:sz="4"/>
               <w:right w:val="single" w:color="D9D3E3" w:sz="4"/>
             </w:tcBorders>
-            <w:shd w:fill="E9F0FA" w:color="auto" w:val="clear"/>
+            <w:shd w:fill="E8F0F8" w:color="auto" w:val="clear"/>
             <w:tcMar>
               <w:top w:type="dxa" w:w="80"/>
               <w:left w:type="dxa" w:w="120"/>
@@ -5697,7 +5743,7 @@
               <w:bottom w:val="single" w:color="D9D3E3" w:sz="4"/>
               <w:right w:val="single" w:color="D9D3E3" w:sz="4"/>
             </w:tcBorders>
-            <w:shd w:fill="E9F0FA" w:color="auto" w:val="clear"/>
+            <w:shd w:fill="E8F0F8" w:color="auto" w:val="clear"/>
             <w:tcMar>
               <w:top w:type="dxa" w:w="80"/>
               <w:left w:type="dxa" w:w="120"/>
@@ -5730,7 +5776,7 @@
               <w:bottom w:val="single" w:color="D9D3E3" w:sz="4"/>
               <w:right w:val="single" w:color="D9D3E3" w:sz="4"/>
             </w:tcBorders>
-            <w:shd w:fill="E9F0FA" w:color="auto" w:val="clear"/>
+            <w:shd w:fill="E8F0F8" w:color="auto" w:val="clear"/>
             <w:tcMar>
               <w:top w:type="dxa" w:w="80"/>
               <w:left w:type="dxa" w:w="120"/>
@@ -5887,7 +5933,7 @@
           <w:rFonts w:ascii="Calibri" w:cs="Calibri" w:eastAsia="Calibri" w:hAnsi="Calibri"/>
           <w:b/>
           <w:bCs/>
-          <w:color w:val="00338D"/>
+          <w:color w:val="00529B"/>
           <w:sz w:val="24"/>
           <w:szCs w:val="24"/>
         </w:rPr>
@@ -6000,7 +6046,7 @@
           <w:rFonts w:ascii="Calibri" w:cs="Calibri" w:eastAsia="Calibri" w:hAnsi="Calibri"/>
           <w:b/>
           <w:bCs/>
-          <w:color w:val="00338D"/>
+          <w:color w:val="00529B"/>
           <w:sz w:val="24"/>
           <w:szCs w:val="24"/>
         </w:rPr>
@@ -6088,7 +6134,7 @@
         <w:pStyle w:val="Heading1"/>
         <w:keepNext/>
         <w:pBdr>
-          <w:bottom w:val="single" w:color="FDB913" w:sz="8" w:space="6"/>
+          <w:bottom w:val="single" w:color="FFCF00" w:sz="8" w:space="6"/>
         </w:pBdr>
         <w:spacing w:after="200" w:before="480"/>
       </w:pPr>
@@ -6097,7 +6143,7 @@
           <w:rFonts w:ascii="Calibri" w:cs="Calibri" w:eastAsia="Calibri" w:hAnsi="Calibri"/>
           <w:b/>
           <w:bCs/>
-          <w:color w:val="FDB913"/>
+          <w:color w:val="8C7200"/>
           <w:sz w:val="30"/>
           <w:szCs w:val="30"/>
         </w:rPr>
@@ -6108,7 +6154,7 @@
           <w:rFonts w:ascii="Calibri" w:cs="Calibri" w:eastAsia="Calibri" w:hAnsi="Calibri"/>
           <w:b/>
           <w:bCs/>
-          <w:color w:val="001F54"/>
+          <w:color w:val="002D55"/>
           <w:sz w:val="30"/>
           <w:szCs w:val="30"/>
         </w:rPr>
@@ -6140,7 +6186,7 @@
           <w:rFonts w:ascii="Calibri" w:cs="Calibri" w:eastAsia="Calibri" w:hAnsi="Calibri"/>
           <w:b/>
           <w:bCs/>
-          <w:color w:val="00338D"/>
+          <w:color w:val="00529B"/>
           <w:sz w:val="24"/>
           <w:szCs w:val="24"/>
         </w:rPr>
@@ -6178,7 +6224,7 @@
               <w:bottom w:val="single" w:color="D9D3E3" w:sz="4"/>
               <w:right w:val="single" w:color="D9D3E3" w:sz="4"/>
             </w:tcBorders>
-            <w:shd w:fill="00338D" w:color="auto" w:val="clear"/>
+            <w:shd w:fill="00529B" w:color="auto" w:val="clear"/>
             <w:tcMar>
               <w:top w:type="dxa" w:w="90"/>
               <w:left w:type="dxa" w:w="120"/>
@@ -6213,7 +6259,7 @@
               <w:bottom w:val="single" w:color="D9D3E3" w:sz="4"/>
               <w:right w:val="single" w:color="D9D3E3" w:sz="4"/>
             </w:tcBorders>
-            <w:shd w:fill="00338D" w:color="auto" w:val="clear"/>
+            <w:shd w:fill="00529B" w:color="auto" w:val="clear"/>
             <w:tcMar>
               <w:top w:type="dxa" w:w="90"/>
               <w:left w:type="dxa" w:w="120"/>
@@ -6248,7 +6294,7 @@
               <w:bottom w:val="single" w:color="D9D3E3" w:sz="4"/>
               <w:right w:val="single" w:color="D9D3E3" w:sz="4"/>
             </w:tcBorders>
-            <w:shd w:fill="00338D" w:color="auto" w:val="clear"/>
+            <w:shd w:fill="00529B" w:color="auto" w:val="clear"/>
             <w:tcMar>
               <w:top w:type="dxa" w:w="90"/>
               <w:left w:type="dxa" w:w="120"/>
@@ -6392,7 +6438,7 @@
               <w:bottom w:val="single" w:color="D9D3E3" w:sz="4"/>
               <w:right w:val="single" w:color="D9D3E3" w:sz="4"/>
             </w:tcBorders>
-            <w:shd w:fill="E9F0FA" w:color="auto" w:val="clear"/>
+            <w:shd w:fill="E8F0F8" w:color="auto" w:val="clear"/>
             <w:tcMar>
               <w:top w:type="dxa" w:w="80"/>
               <w:left w:type="dxa" w:w="120"/>
@@ -6425,7 +6471,7 @@
               <w:bottom w:val="single" w:color="D9D3E3" w:sz="4"/>
               <w:right w:val="single" w:color="D9D3E3" w:sz="4"/>
             </w:tcBorders>
-            <w:shd w:fill="E9F0FA" w:color="auto" w:val="clear"/>
+            <w:shd w:fill="E8F0F8" w:color="auto" w:val="clear"/>
             <w:tcMar>
               <w:top w:type="dxa" w:w="80"/>
               <w:left w:type="dxa" w:w="120"/>
@@ -6458,7 +6504,7 @@
               <w:bottom w:val="single" w:color="D9D3E3" w:sz="4"/>
               <w:right w:val="single" w:color="D9D3E3" w:sz="4"/>
             </w:tcBorders>
-            <w:shd w:fill="E9F0FA" w:color="auto" w:val="clear"/>
+            <w:shd w:fill="E8F0F8" w:color="auto" w:val="clear"/>
             <w:tcMar>
               <w:top w:type="dxa" w:w="80"/>
               <w:left w:type="dxa" w:w="120"/>
@@ -6600,7 +6646,7 @@
               <w:bottom w:val="single" w:color="D9D3E3" w:sz="4"/>
               <w:right w:val="single" w:color="D9D3E3" w:sz="4"/>
             </w:tcBorders>
-            <w:shd w:fill="E9F0FA" w:color="auto" w:val="clear"/>
+            <w:shd w:fill="E8F0F8" w:color="auto" w:val="clear"/>
             <w:tcMar>
               <w:top w:type="dxa" w:w="80"/>
               <w:left w:type="dxa" w:w="120"/>
@@ -6633,7 +6679,7 @@
               <w:bottom w:val="single" w:color="D9D3E3" w:sz="4"/>
               <w:right w:val="single" w:color="D9D3E3" w:sz="4"/>
             </w:tcBorders>
-            <w:shd w:fill="E9F0FA" w:color="auto" w:val="clear"/>
+            <w:shd w:fill="E8F0F8" w:color="auto" w:val="clear"/>
             <w:tcMar>
               <w:top w:type="dxa" w:w="80"/>
               <w:left w:type="dxa" w:w="120"/>
@@ -6666,7 +6712,7 @@
               <w:bottom w:val="single" w:color="D9D3E3" w:sz="4"/>
               <w:right w:val="single" w:color="D9D3E3" w:sz="4"/>
             </w:tcBorders>
-            <w:shd w:fill="E9F0FA" w:color="auto" w:val="clear"/>
+            <w:shd w:fill="E8F0F8" w:color="auto" w:val="clear"/>
             <w:tcMar>
               <w:top w:type="dxa" w:w="80"/>
               <w:left w:type="dxa" w:w="120"/>
@@ -6808,7 +6854,7 @@
               <w:bottom w:val="single" w:color="D9D3E3" w:sz="4"/>
               <w:right w:val="single" w:color="D9D3E3" w:sz="4"/>
             </w:tcBorders>
-            <w:shd w:fill="E9F0FA" w:color="auto" w:val="clear"/>
+            <w:shd w:fill="E8F0F8" w:color="auto" w:val="clear"/>
             <w:tcMar>
               <w:top w:type="dxa" w:w="80"/>
               <w:left w:type="dxa" w:w="120"/>
@@ -6841,7 +6887,7 @@
               <w:bottom w:val="single" w:color="D9D3E3" w:sz="4"/>
               <w:right w:val="single" w:color="D9D3E3" w:sz="4"/>
             </w:tcBorders>
-            <w:shd w:fill="E9F0FA" w:color="auto" w:val="clear"/>
+            <w:shd w:fill="E8F0F8" w:color="auto" w:val="clear"/>
             <w:tcMar>
               <w:top w:type="dxa" w:w="80"/>
               <w:left w:type="dxa" w:w="120"/>
@@ -6874,7 +6920,7 @@
               <w:bottom w:val="single" w:color="D9D3E3" w:sz="4"/>
               <w:right w:val="single" w:color="D9D3E3" w:sz="4"/>
             </w:tcBorders>
-            <w:shd w:fill="E9F0FA" w:color="auto" w:val="clear"/>
+            <w:shd w:fill="E8F0F8" w:color="auto" w:val="clear"/>
             <w:tcMar>
               <w:top w:type="dxa" w:w="80"/>
               <w:left w:type="dxa" w:w="120"/>
@@ -6916,7 +6962,7 @@
           <w:rFonts w:ascii="Calibri" w:cs="Calibri" w:eastAsia="Calibri" w:hAnsi="Calibri"/>
           <w:b/>
           <w:bCs/>
-          <w:color w:val="00338D"/>
+          <w:color w:val="00529B"/>
           <w:sz w:val="24"/>
           <w:szCs w:val="24"/>
         </w:rPr>
@@ -6933,7 +6979,7 @@
           <w:rFonts w:ascii="Calibri" w:cs="Calibri" w:eastAsia="Calibri" w:hAnsi="Calibri"/>
           <w:b/>
           <w:bCs/>
-          <w:color w:val="00338D"/>
+          <w:color w:val="00529B"/>
           <w:sz w:val="21"/>
           <w:szCs w:val="21"/>
         </w:rPr>
@@ -6959,7 +7005,7 @@
           <w:rFonts w:ascii="Calibri" w:cs="Calibri" w:eastAsia="Calibri" w:hAnsi="Calibri"/>
           <w:b/>
           <w:bCs/>
-          <w:color w:val="00338D"/>
+          <w:color w:val="00529B"/>
           <w:sz w:val="21"/>
           <w:szCs w:val="21"/>
         </w:rPr>
@@ -6985,7 +7031,7 @@
           <w:rFonts w:ascii="Calibri" w:cs="Calibri" w:eastAsia="Calibri" w:hAnsi="Calibri"/>
           <w:b/>
           <w:bCs/>
-          <w:color w:val="00338D"/>
+          <w:color w:val="00529B"/>
           <w:sz w:val="21"/>
           <w:szCs w:val="21"/>
         </w:rPr>
@@ -7011,7 +7057,7 @@
           <w:rFonts w:ascii="Calibri" w:cs="Calibri" w:eastAsia="Calibri" w:hAnsi="Calibri"/>
           <w:b/>
           <w:bCs/>
-          <w:color w:val="00338D"/>
+          <w:color w:val="00529B"/>
           <w:sz w:val="21"/>
           <w:szCs w:val="21"/>
         </w:rPr>
@@ -7037,7 +7083,7 @@
           <w:rFonts w:ascii="Calibri" w:cs="Calibri" w:eastAsia="Calibri" w:hAnsi="Calibri"/>
           <w:b/>
           <w:bCs/>
-          <w:color w:val="00338D"/>
+          <w:color w:val="00529B"/>
           <w:sz w:val="21"/>
           <w:szCs w:val="21"/>
         </w:rPr>
@@ -7063,7 +7109,7 @@
           <w:rFonts w:ascii="Calibri" w:cs="Calibri" w:eastAsia="Calibri" w:hAnsi="Calibri"/>
           <w:b/>
           <w:bCs/>
-          <w:color w:val="00338D"/>
+          <w:color w:val="00529B"/>
           <w:sz w:val="21"/>
           <w:szCs w:val="21"/>
         </w:rPr>
@@ -7089,7 +7135,7 @@
           <w:rFonts w:ascii="Calibri" w:cs="Calibri" w:eastAsia="Calibri" w:hAnsi="Calibri"/>
           <w:b/>
           <w:bCs/>
-          <w:color w:val="00338D"/>
+          <w:color w:val="00529B"/>
           <w:sz w:val="21"/>
           <w:szCs w:val="21"/>
         </w:rPr>
@@ -7110,7 +7156,7 @@
         <w:pStyle w:val="Heading1"/>
         <w:keepNext/>
         <w:pBdr>
-          <w:bottom w:val="single" w:color="FDB913" w:sz="8" w:space="6"/>
+          <w:bottom w:val="single" w:color="FFCF00" w:sz="8" w:space="6"/>
         </w:pBdr>
         <w:spacing w:after="200" w:before="480"/>
       </w:pPr>
@@ -7119,7 +7165,7 @@
           <w:rFonts w:ascii="Calibri" w:cs="Calibri" w:eastAsia="Calibri" w:hAnsi="Calibri"/>
           <w:b/>
           <w:bCs/>
-          <w:color w:val="FDB913"/>
+          <w:color w:val="8C7200"/>
           <w:sz w:val="30"/>
           <w:szCs w:val="30"/>
         </w:rPr>
@@ -7130,7 +7176,7 @@
           <w:rFonts w:ascii="Calibri" w:cs="Calibri" w:eastAsia="Calibri" w:hAnsi="Calibri"/>
           <w:b/>
           <w:bCs/>
-          <w:color w:val="001F54"/>
+          <w:color w:val="002D55"/>
           <w:sz w:val="30"/>
           <w:szCs w:val="30"/>
         </w:rPr>
@@ -7168,7 +7214,7 @@
               <w:bottom w:val="single" w:color="D9D3E3" w:sz="4"/>
               <w:right w:val="single" w:color="D9D3E3" w:sz="4"/>
             </w:tcBorders>
-            <w:shd w:fill="00338D" w:color="auto" w:val="clear"/>
+            <w:shd w:fill="00529B" w:color="auto" w:val="clear"/>
             <w:tcMar>
               <w:top w:type="dxa" w:w="90"/>
               <w:left w:type="dxa" w:w="120"/>
@@ -7203,7 +7249,7 @@
               <w:bottom w:val="single" w:color="D9D3E3" w:sz="4"/>
               <w:right w:val="single" w:color="D9D3E3" w:sz="4"/>
             </w:tcBorders>
-            <w:shd w:fill="00338D" w:color="auto" w:val="clear"/>
+            <w:shd w:fill="00529B" w:color="auto" w:val="clear"/>
             <w:tcMar>
               <w:top w:type="dxa" w:w="90"/>
               <w:left w:type="dxa" w:w="120"/>
@@ -7238,7 +7284,7 @@
               <w:bottom w:val="single" w:color="D9D3E3" w:sz="4"/>
               <w:right w:val="single" w:color="D9D3E3" w:sz="4"/>
             </w:tcBorders>
-            <w:shd w:fill="00338D" w:color="auto" w:val="clear"/>
+            <w:shd w:fill="00529B" w:color="auto" w:val="clear"/>
             <w:tcMar>
               <w:top w:type="dxa" w:w="90"/>
               <w:left w:type="dxa" w:w="120"/>
@@ -7382,7 +7428,7 @@
               <w:bottom w:val="single" w:color="D9D3E3" w:sz="4"/>
               <w:right w:val="single" w:color="D9D3E3" w:sz="4"/>
             </w:tcBorders>
-            <w:shd w:fill="E9F0FA" w:color="auto" w:val="clear"/>
+            <w:shd w:fill="E8F0F8" w:color="auto" w:val="clear"/>
             <w:tcMar>
               <w:top w:type="dxa" w:w="80"/>
               <w:left w:type="dxa" w:w="120"/>
@@ -7415,7 +7461,7 @@
               <w:bottom w:val="single" w:color="D9D3E3" w:sz="4"/>
               <w:right w:val="single" w:color="D9D3E3" w:sz="4"/>
             </w:tcBorders>
-            <w:shd w:fill="E9F0FA" w:color="auto" w:val="clear"/>
+            <w:shd w:fill="E8F0F8" w:color="auto" w:val="clear"/>
             <w:tcMar>
               <w:top w:type="dxa" w:w="80"/>
               <w:left w:type="dxa" w:w="120"/>
@@ -7448,7 +7494,7 @@
               <w:bottom w:val="single" w:color="D9D3E3" w:sz="4"/>
               <w:right w:val="single" w:color="D9D3E3" w:sz="4"/>
             </w:tcBorders>
-            <w:shd w:fill="E9F0FA" w:color="auto" w:val="clear"/>
+            <w:shd w:fill="E8F0F8" w:color="auto" w:val="clear"/>
             <w:tcMar>
               <w:top w:type="dxa" w:w="80"/>
               <w:left w:type="dxa" w:w="120"/>
@@ -7590,7 +7636,7 @@
               <w:bottom w:val="single" w:color="D9D3E3" w:sz="4"/>
               <w:right w:val="single" w:color="D9D3E3" w:sz="4"/>
             </w:tcBorders>
-            <w:shd w:fill="E9F0FA" w:color="auto" w:val="clear"/>
+            <w:shd w:fill="E8F0F8" w:color="auto" w:val="clear"/>
             <w:tcMar>
               <w:top w:type="dxa" w:w="80"/>
               <w:left w:type="dxa" w:w="120"/>
@@ -7623,7 +7669,7 @@
               <w:bottom w:val="single" w:color="D9D3E3" w:sz="4"/>
               <w:right w:val="single" w:color="D9D3E3" w:sz="4"/>
             </w:tcBorders>
-            <w:shd w:fill="E9F0FA" w:color="auto" w:val="clear"/>
+            <w:shd w:fill="E8F0F8" w:color="auto" w:val="clear"/>
             <w:tcMar>
               <w:top w:type="dxa" w:w="80"/>
               <w:left w:type="dxa" w:w="120"/>
@@ -7656,7 +7702,7 @@
               <w:bottom w:val="single" w:color="D9D3E3" w:sz="4"/>
               <w:right w:val="single" w:color="D9D3E3" w:sz="4"/>
             </w:tcBorders>
-            <w:shd w:fill="E9F0FA" w:color="auto" w:val="clear"/>
+            <w:shd w:fill="E8F0F8" w:color="auto" w:val="clear"/>
             <w:tcMar>
               <w:top w:type="dxa" w:w="80"/>
               <w:left w:type="dxa" w:w="120"/>
@@ -7711,11 +7757,11 @@
             <w:tcW w:type="pct" w:w="100%"/>
             <w:tcBorders>
               <w:top w:val="single" w:color="D9D3E3" w:sz="4"/>
-              <w:left w:val="single" w:color="FDB913" w:sz="24"/>
-              <w:bottom w:val="single" w:color="D9D3E3" w:sz="4"/>
-              <w:right w:val="single" w:color="D9D3E3" w:sz="4"/>
-            </w:tcBorders>
-            <w:shd w:fill="FFF6DF" w:color="auto" w:val="clear"/>
+              <w:left w:val="single" w:color="8C7200" w:sz="24"/>
+              <w:bottom w:val="single" w:color="D9D3E3" w:sz="4"/>
+              <w:right w:val="single" w:color="D9D3E3" w:sz="4"/>
+            </w:tcBorders>
+            <w:shd w:fill="FFF7DD" w:color="auto" w:val="clear"/>
             <w:tcMar>
               <w:top w:type="dxa" w:w="160"/>
               <w:left w:type="dxa" w:w="220"/>
@@ -7732,7 +7778,7 @@
                 <w:rFonts w:ascii="Calibri" w:cs="Calibri" w:eastAsia="Calibri" w:hAnsi="Calibri"/>
                 <w:b/>
                 <w:bCs/>
-                <w:color w:val="FDB913"/>
+                <w:color w:val="8C7200"/>
                 <w:sz w:val="20"/>
                 <w:szCs w:val="20"/>
               </w:rPr>
@@ -7761,7 +7807,7 @@
         <w:pStyle w:val="Heading1"/>
         <w:keepNext/>
         <w:pBdr>
-          <w:bottom w:val="single" w:color="FDB913" w:sz="8" w:space="6"/>
+          <w:bottom w:val="single" w:color="FFCF00" w:sz="8" w:space="6"/>
         </w:pBdr>
         <w:spacing w:after="200" w:before="480"/>
       </w:pPr>
@@ -7770,7 +7816,7 @@
           <w:rFonts w:ascii="Calibri" w:cs="Calibri" w:eastAsia="Calibri" w:hAnsi="Calibri"/>
           <w:b/>
           <w:bCs/>
-          <w:color w:val="FDB913"/>
+          <w:color w:val="8C7200"/>
           <w:sz w:val="30"/>
           <w:szCs w:val="30"/>
         </w:rPr>
@@ -7781,7 +7827,7 @@
           <w:rFonts w:ascii="Calibri" w:cs="Calibri" w:eastAsia="Calibri" w:hAnsi="Calibri"/>
           <w:b/>
           <w:bCs/>
-          <w:color w:val="001F54"/>
+          <w:color w:val="002D55"/>
           <w:sz w:val="30"/>
           <w:szCs w:val="30"/>
         </w:rPr>
@@ -7819,7 +7865,7 @@
               <w:bottom w:val="single" w:color="D9D3E3" w:sz="4"/>
               <w:right w:val="single" w:color="D9D3E3" w:sz="4"/>
             </w:tcBorders>
-            <w:shd w:fill="00338D" w:color="auto" w:val="clear"/>
+            <w:shd w:fill="00529B" w:color="auto" w:val="clear"/>
             <w:tcMar>
               <w:top w:type="dxa" w:w="90"/>
               <w:left w:type="dxa" w:w="120"/>
@@ -7854,7 +7900,7 @@
               <w:bottom w:val="single" w:color="D9D3E3" w:sz="4"/>
               <w:right w:val="single" w:color="D9D3E3" w:sz="4"/>
             </w:tcBorders>
-            <w:shd w:fill="00338D" w:color="auto" w:val="clear"/>
+            <w:shd w:fill="00529B" w:color="auto" w:val="clear"/>
             <w:tcMar>
               <w:top w:type="dxa" w:w="90"/>
               <w:left w:type="dxa" w:w="120"/>
@@ -7889,7 +7935,7 @@
               <w:bottom w:val="single" w:color="D9D3E3" w:sz="4"/>
               <w:right w:val="single" w:color="D9D3E3" w:sz="4"/>
             </w:tcBorders>
-            <w:shd w:fill="00338D" w:color="auto" w:val="clear"/>
+            <w:shd w:fill="00529B" w:color="auto" w:val="clear"/>
             <w:tcMar>
               <w:top w:type="dxa" w:w="90"/>
               <w:left w:type="dxa" w:w="120"/>
@@ -8033,7 +8079,7 @@
               <w:bottom w:val="single" w:color="D9D3E3" w:sz="4"/>
               <w:right w:val="single" w:color="D9D3E3" w:sz="4"/>
             </w:tcBorders>
-            <w:shd w:fill="E9F0FA" w:color="auto" w:val="clear"/>
+            <w:shd w:fill="E8F0F8" w:color="auto" w:val="clear"/>
             <w:tcMar>
               <w:top w:type="dxa" w:w="80"/>
               <w:left w:type="dxa" w:w="120"/>
@@ -8066,7 +8112,7 @@
               <w:bottom w:val="single" w:color="D9D3E3" w:sz="4"/>
               <w:right w:val="single" w:color="D9D3E3" w:sz="4"/>
             </w:tcBorders>
-            <w:shd w:fill="E9F0FA" w:color="auto" w:val="clear"/>
+            <w:shd w:fill="E8F0F8" w:color="auto" w:val="clear"/>
             <w:tcMar>
               <w:top w:type="dxa" w:w="80"/>
               <w:left w:type="dxa" w:w="120"/>
@@ -8099,7 +8145,7 @@
               <w:bottom w:val="single" w:color="D9D3E3" w:sz="4"/>
               <w:right w:val="single" w:color="D9D3E3" w:sz="4"/>
             </w:tcBorders>
-            <w:shd w:fill="E9F0FA" w:color="auto" w:val="clear"/>
+            <w:shd w:fill="E8F0F8" w:color="auto" w:val="clear"/>
             <w:tcMar>
               <w:top w:type="dxa" w:w="80"/>
               <w:left w:type="dxa" w:w="120"/>
@@ -8241,7 +8287,7 @@
               <w:bottom w:val="single" w:color="D9D3E3" w:sz="4"/>
               <w:right w:val="single" w:color="D9D3E3" w:sz="4"/>
             </w:tcBorders>
-            <w:shd w:fill="E9F0FA" w:color="auto" w:val="clear"/>
+            <w:shd w:fill="E8F0F8" w:color="auto" w:val="clear"/>
             <w:tcMar>
               <w:top w:type="dxa" w:w="80"/>
               <w:left w:type="dxa" w:w="120"/>
@@ -8274,7 +8320,7 @@
               <w:bottom w:val="single" w:color="D9D3E3" w:sz="4"/>
               <w:right w:val="single" w:color="D9D3E3" w:sz="4"/>
             </w:tcBorders>
-            <w:shd w:fill="E9F0FA" w:color="auto" w:val="clear"/>
+            <w:shd w:fill="E8F0F8" w:color="auto" w:val="clear"/>
             <w:tcMar>
               <w:top w:type="dxa" w:w="80"/>
               <w:left w:type="dxa" w:w="120"/>
@@ -8307,7 +8353,7 @@
               <w:bottom w:val="single" w:color="D9D3E3" w:sz="4"/>
               <w:right w:val="single" w:color="D9D3E3" w:sz="4"/>
             </w:tcBorders>
-            <w:shd w:fill="E9F0FA" w:color="auto" w:val="clear"/>
+            <w:shd w:fill="E8F0F8" w:color="auto" w:val="clear"/>
             <w:tcMar>
               <w:top w:type="dxa" w:w="80"/>
               <w:left w:type="dxa" w:w="120"/>
@@ -8449,7 +8495,7 @@
               <w:bottom w:val="single" w:color="D9D3E3" w:sz="4"/>
               <w:right w:val="single" w:color="D9D3E3" w:sz="4"/>
             </w:tcBorders>
-            <w:shd w:fill="E9F0FA" w:color="auto" w:val="clear"/>
+            <w:shd w:fill="E8F0F8" w:color="auto" w:val="clear"/>
             <w:tcMar>
               <w:top w:type="dxa" w:w="80"/>
               <w:left w:type="dxa" w:w="120"/>
@@ -8482,7 +8528,7 @@
               <w:bottom w:val="single" w:color="D9D3E3" w:sz="4"/>
               <w:right w:val="single" w:color="D9D3E3" w:sz="4"/>
             </w:tcBorders>
-            <w:shd w:fill="E9F0FA" w:color="auto" w:val="clear"/>
+            <w:shd w:fill="E8F0F8" w:color="auto" w:val="clear"/>
             <w:tcMar>
               <w:top w:type="dxa" w:w="80"/>
               <w:left w:type="dxa" w:w="120"/>
@@ -8515,7 +8561,7 @@
               <w:bottom w:val="single" w:color="D9D3E3" w:sz="4"/>
               <w:right w:val="single" w:color="D9D3E3" w:sz="4"/>
             </w:tcBorders>
-            <w:shd w:fill="E9F0FA" w:color="auto" w:val="clear"/>
+            <w:shd w:fill="E8F0F8" w:color="auto" w:val="clear"/>
             <w:tcMar>
               <w:top w:type="dxa" w:w="80"/>
               <w:left w:type="dxa" w:w="120"/>
@@ -8657,7 +8703,7 @@
               <w:bottom w:val="single" w:color="D9D3E3" w:sz="4"/>
               <w:right w:val="single" w:color="D9D3E3" w:sz="4"/>
             </w:tcBorders>
-            <w:shd w:fill="E9F0FA" w:color="auto" w:val="clear"/>
+            <w:shd w:fill="E8F0F8" w:color="auto" w:val="clear"/>
             <w:tcMar>
               <w:top w:type="dxa" w:w="80"/>
               <w:left w:type="dxa" w:w="120"/>
@@ -8690,7 +8736,7 @@
               <w:bottom w:val="single" w:color="D9D3E3" w:sz="4"/>
               <w:right w:val="single" w:color="D9D3E3" w:sz="4"/>
             </w:tcBorders>
-            <w:shd w:fill="E9F0FA" w:color="auto" w:val="clear"/>
+            <w:shd w:fill="E8F0F8" w:color="auto" w:val="clear"/>
             <w:tcMar>
               <w:top w:type="dxa" w:w="80"/>
               <w:left w:type="dxa" w:w="120"/>
@@ -8723,7 +8769,7 @@
               <w:bottom w:val="single" w:color="D9D3E3" w:sz="4"/>
               <w:right w:val="single" w:color="D9D3E3" w:sz="4"/>
             </w:tcBorders>
-            <w:shd w:fill="E9F0FA" w:color="auto" w:val="clear"/>
+            <w:shd w:fill="E8F0F8" w:color="auto" w:val="clear"/>
             <w:tcMar>
               <w:top w:type="dxa" w:w="80"/>
               <w:left w:type="dxa" w:w="120"/>
@@ -8754,7 +8800,7 @@
         <w:pStyle w:val="Heading1"/>
         <w:keepNext/>
         <w:pBdr>
-          <w:bottom w:val="single" w:color="FDB913" w:sz="8" w:space="6"/>
+          <w:bottom w:val="single" w:color="FFCF00" w:sz="8" w:space="6"/>
         </w:pBdr>
         <w:spacing w:after="200" w:before="480"/>
       </w:pPr>
@@ -8763,7 +8809,7 @@
           <w:rFonts w:ascii="Calibri" w:cs="Calibri" w:eastAsia="Calibri" w:hAnsi="Calibri"/>
           <w:b/>
           <w:bCs/>
-          <w:color w:val="FDB913"/>
+          <w:color w:val="8C7200"/>
           <w:sz w:val="30"/>
           <w:szCs w:val="30"/>
         </w:rPr>
@@ -8774,7 +8820,7 @@
           <w:rFonts w:ascii="Calibri" w:cs="Calibri" w:eastAsia="Calibri" w:hAnsi="Calibri"/>
           <w:b/>
           <w:bCs/>
-          <w:color w:val="001F54"/>
+          <w:color w:val="002D55"/>
           <w:sz w:val="30"/>
           <w:szCs w:val="30"/>
         </w:rPr>
@@ -8993,7 +9039,7 @@
         <w:pStyle w:val="Heading1"/>
         <w:keepNext/>
         <w:pBdr>
-          <w:bottom w:val="single" w:color="FDB913" w:sz="8" w:space="6"/>
+          <w:bottom w:val="single" w:color="FFCF00" w:sz="8" w:space="6"/>
         </w:pBdr>
         <w:spacing w:after="200" w:before="480"/>
       </w:pPr>
@@ -9002,7 +9048,7 @@
           <w:rFonts w:ascii="Calibri" w:cs="Calibri" w:eastAsia="Calibri" w:hAnsi="Calibri"/>
           <w:b/>
           <w:bCs/>
-          <w:color w:val="FDB913"/>
+          <w:color w:val="8C7200"/>
           <w:sz w:val="30"/>
           <w:szCs w:val="30"/>
         </w:rPr>
@@ -9013,7 +9059,7 @@
           <w:rFonts w:ascii="Calibri" w:cs="Calibri" w:eastAsia="Calibri" w:hAnsi="Calibri"/>
           <w:b/>
           <w:bCs/>
-          <w:color w:val="001F54"/>
+          <w:color w:val="002D55"/>
           <w:sz w:val="30"/>
           <w:szCs w:val="30"/>
         </w:rPr>
@@ -9053,7 +9099,7 @@
         <w:pStyle w:val="Heading1"/>
         <w:keepNext/>
         <w:pBdr>
-          <w:bottom w:val="single" w:color="FDB913" w:sz="8" w:space="6"/>
+          <w:bottom w:val="single" w:color="FFCF00" w:sz="8" w:space="6"/>
         </w:pBdr>
         <w:spacing w:after="200" w:before="480"/>
       </w:pPr>
@@ -9062,7 +9108,7 @@
           <w:rFonts w:ascii="Calibri" w:cs="Calibri" w:eastAsia="Calibri" w:hAnsi="Calibri"/>
           <w:b/>
           <w:bCs/>
-          <w:color w:val="FDB913"/>
+          <w:color w:val="8C7200"/>
           <w:sz w:val="30"/>
           <w:szCs w:val="30"/>
         </w:rPr>
@@ -9073,7 +9119,7 @@
           <w:rFonts w:ascii="Calibri" w:cs="Calibri" w:eastAsia="Calibri" w:hAnsi="Calibri"/>
           <w:b/>
           <w:bCs/>
-          <w:color w:val="001F54"/>
+          <w:color w:val="002D55"/>
           <w:sz w:val="30"/>
           <w:szCs w:val="30"/>
         </w:rPr>
@@ -9091,7 +9137,7 @@
           <w:rFonts w:ascii="Calibri" w:cs="Calibri" w:eastAsia="Calibri" w:hAnsi="Calibri"/>
           <w:b/>
           <w:bCs/>
-          <w:color w:val="00338D"/>
+          <w:color w:val="00529B"/>
           <w:sz w:val="24"/>
           <w:szCs w:val="24"/>
         </w:rPr>
@@ -9147,7 +9193,7 @@
           <w:rFonts w:ascii="Calibri" w:cs="Calibri" w:eastAsia="Calibri" w:hAnsi="Calibri"/>
           <w:b/>
           <w:bCs/>
-          <w:color w:val="00338D"/>
+          <w:color w:val="00529B"/>
           <w:sz w:val="24"/>
           <w:szCs w:val="24"/>
         </w:rPr>
@@ -9259,7 +9305,7 @@
         <w:pStyle w:val="Heading1"/>
         <w:keepNext/>
         <w:pBdr>
-          <w:bottom w:val="single" w:color="FDB913" w:sz="8" w:space="6"/>
+          <w:bottom w:val="single" w:color="FFCF00" w:sz="8" w:space="6"/>
         </w:pBdr>
         <w:spacing w:after="200" w:before="480"/>
       </w:pPr>
@@ -9268,7 +9314,7 @@
           <w:rFonts w:ascii="Calibri" w:cs="Calibri" w:eastAsia="Calibri" w:hAnsi="Calibri"/>
           <w:b/>
           <w:bCs/>
-          <w:color w:val="FDB913"/>
+          <w:color w:val="8C7200"/>
           <w:sz w:val="30"/>
           <w:szCs w:val="30"/>
         </w:rPr>
@@ -9279,7 +9325,7 @@
           <w:rFonts w:ascii="Calibri" w:cs="Calibri" w:eastAsia="Calibri" w:hAnsi="Calibri"/>
           <w:b/>
           <w:bCs/>
-          <w:color w:val="001F54"/>
+          <w:color w:val="002D55"/>
           <w:sz w:val="30"/>
           <w:szCs w:val="30"/>
         </w:rPr>
@@ -9313,78 +9359,6 @@
         <w:drawing>
           <wp:inline distT="0" distB="0" distL="0" distR="0">
             <wp:extent cx="5524500" cy="3638550"/>
-            <wp:effectExtent t="0" r="0" b="0" l="0"/>
-            <wp:docPr id="1" name="" descr="" title=""/>
-            <wp:cNvGraphicFramePr>
-              <a:graphicFrameLocks xmlns:a="http://schemas.openxmlformats.org/drawingml/2006/main" noChangeAspect="1"/>
-            </wp:cNvGraphicFramePr>
-            <a:graphic xmlns:a="http://schemas.openxmlformats.org/drawingml/2006/main">
-              <a:graphicData uri="http://schemas.openxmlformats.org/drawingml/2006/picture">
-                <pic:pic xmlns:pic="http://schemas.openxmlformats.org/drawingml/2006/picture">
-                  <pic:nvPicPr>
-                    <pic:cNvPr id="0" name="" descr=""/>
-                    <pic:cNvPicPr>
-                      <a:picLocks noChangeAspect="1" noChangeArrowheads="1"/>
-                    </pic:cNvPicPr>
-                  </pic:nvPicPr>
-                  <pic:blipFill>
-                    <a:blip r:embed="rId11" cstate="none"/>
-                    <a:srcRect/>
-                    <a:stretch>
-                      <a:fillRect/>
-                    </a:stretch>
-                  </pic:blipFill>
-                  <pic:spPr bwMode="auto">
-                    <a:xfrm>
-                      <a:off x="0" y="0"/>
-                      <a:ext cx="5524500" cy="3638550"/>
-                    </a:xfrm>
-                    <a:prstGeom prst="rect">
-                      <a:avLst/>
-                    </a:prstGeom>
-                  </pic:spPr>
-                </pic:pic>
-              </a:graphicData>
-            </a:graphic>
-          </wp:inline>
-        </w:drawing>
-      </w:r>
-    </w:p>
-    <w:p>
-      <w:pPr>
-        <w:spacing w:after="260"/>
-      </w:pPr>
-      <w:r>
-        <w:rPr>
-          <w:rFonts w:ascii="Calibri" w:cs="Calibri" w:eastAsia="Calibri" w:hAnsi="Calibri"/>
-          <w:b/>
-          <w:bCs/>
-          <w:color w:val="001F54"/>
-          <w:sz w:val="19"/>
-          <w:szCs w:val="19"/>
-        </w:rPr>
-        <w:t xml:space="preserve">Mapa 1 · Salón de eventos y núcleo de baños</w:t>
-      </w:r>
-      <w:r>
-        <w:rPr>
-          <w:rFonts w:ascii="Calibri" w:cs="Calibri" w:eastAsia="Calibri" w:hAnsi="Calibri"/>
-          <w:i/>
-          <w:iCs/>
-          <w:color w:val="5B5B5B"/>
-          <w:sz w:val="19"/>
-          <w:szCs w:val="19"/>
-        </w:rPr>
-        <w:t xml:space="preserve">  —  Superficie aproximada: 87 m².</w:t>
-      </w:r>
-    </w:p>
-    <w:p>
-      <w:pPr>
-        <w:spacing w:after="60" w:before="160"/>
-      </w:pPr>
-      <w:r>
-        <w:drawing>
-          <wp:inline distT="0" distB="0" distL="0" distR="0">
-            <wp:extent cx="5524500" cy="2057400"/>
             <wp:effectExtent t="0" r="0" b="0" l="0"/>
             <wp:docPr id="1" name="" descr="" title=""/>
             <wp:cNvGraphicFramePr>
@@ -9409,7 +9383,7 @@
                   <pic:spPr bwMode="auto">
                     <a:xfrm>
                       <a:off x="0" y="0"/>
-                      <a:ext cx="5524500" cy="2057400"/>
+                      <a:ext cx="5524500" cy="3638550"/>
                     </a:xfrm>
                     <a:prstGeom prst="rect">
                       <a:avLst/>
@@ -9431,11 +9405,11 @@
           <w:rFonts w:ascii="Calibri" w:cs="Calibri" w:eastAsia="Calibri" w:hAnsi="Calibri"/>
           <w:b/>
           <w:bCs/>
-          <w:color w:val="001F54"/>
+          <w:color w:val="002D55"/>
           <w:sz w:val="19"/>
           <w:szCs w:val="19"/>
         </w:rPr>
-        <w:t xml:space="preserve">Mapa 2 · Salas 1 y 2</w:t>
+        <w:t xml:space="preserve">Mapa 1 · Salón de eventos y núcleo de baños</w:t>
       </w:r>
       <w:r>
         <w:rPr>
@@ -9446,7 +9420,7 @@
           <w:sz w:val="19"/>
           <w:szCs w:val="19"/>
         </w:rPr>
-        <w:t xml:space="preserve">  —  La superficie completa de Sala 2 permanece pendiente.</w:t>
+        <w:t xml:space="preserve">  —  Superficie aproximada: 87 m².</w:t>
       </w:r>
     </w:p>
     <w:p>
@@ -9456,7 +9430,7 @@
       <w:r>
         <w:drawing>
           <wp:inline distT="0" distB="0" distL="0" distR="0">
-            <wp:extent cx="5524500" cy="1990725"/>
+            <wp:extent cx="5524500" cy="2057400"/>
             <wp:effectExtent t="0" r="0" b="0" l="0"/>
             <wp:docPr id="1" name="" descr="" title=""/>
             <wp:cNvGraphicFramePr>
@@ -9481,7 +9455,7 @@
                   <pic:spPr bwMode="auto">
                     <a:xfrm>
                       <a:off x="0" y="0"/>
-                      <a:ext cx="5524500" cy="1990725"/>
+                      <a:ext cx="5524500" cy="2057400"/>
                     </a:xfrm>
                     <a:prstGeom prst="rect">
                       <a:avLst/>
@@ -9503,11 +9477,11 @@
           <w:rFonts w:ascii="Calibri" w:cs="Calibri" w:eastAsia="Calibri" w:hAnsi="Calibri"/>
           <w:b/>
           <w:bCs/>
-          <w:color w:val="001F54"/>
+          <w:color w:val="002D55"/>
           <w:sz w:val="19"/>
           <w:szCs w:val="19"/>
         </w:rPr>
-        <w:t xml:space="preserve">Mapa 3 · Sala 3 y Sala 4 / oficina</w:t>
+        <w:t xml:space="preserve">Mapa 2 · Salas 1 y 2</w:t>
       </w:r>
       <w:r>
         <w:rPr>
@@ -9518,7 +9492,7 @@
           <w:sz w:val="19"/>
           <w:szCs w:val="19"/>
         </w:rPr>
-        <w:t xml:space="preserve">  —  Cotas contradictorias o relaciones geométricas por confirmar.</w:t>
+        <w:t xml:space="preserve">  —  La superficie completa de Sala 2 permanece pendiente.</w:t>
       </w:r>
     </w:p>
     <w:p>
@@ -9528,7 +9502,7 @@
       <w:r>
         <w:drawing>
           <wp:inline distT="0" distB="0" distL="0" distR="0">
-            <wp:extent cx="5524500" cy="2752725"/>
+            <wp:extent cx="5524500" cy="1990725"/>
             <wp:effectExtent t="0" r="0" b="0" l="0"/>
             <wp:docPr id="1" name="" descr="" title=""/>
             <wp:cNvGraphicFramePr>
@@ -9553,6 +9527,78 @@
                   <pic:spPr bwMode="auto">
                     <a:xfrm>
                       <a:off x="0" y="0"/>
+                      <a:ext cx="5524500" cy="1990725"/>
+                    </a:xfrm>
+                    <a:prstGeom prst="rect">
+                      <a:avLst/>
+                    </a:prstGeom>
+                  </pic:spPr>
+                </pic:pic>
+              </a:graphicData>
+            </a:graphic>
+          </wp:inline>
+        </w:drawing>
+      </w:r>
+    </w:p>
+    <w:p>
+      <w:pPr>
+        <w:spacing w:after="260"/>
+      </w:pPr>
+      <w:r>
+        <w:rPr>
+          <w:rFonts w:ascii="Calibri" w:cs="Calibri" w:eastAsia="Calibri" w:hAnsi="Calibri"/>
+          <w:b/>
+          <w:bCs/>
+          <w:color w:val="002D55"/>
+          <w:sz w:val="19"/>
+          <w:szCs w:val="19"/>
+        </w:rPr>
+        <w:t xml:space="preserve">Mapa 3 · Sala 3 y Sala 4 / oficina</w:t>
+      </w:r>
+      <w:r>
+        <w:rPr>
+          <w:rFonts w:ascii="Calibri" w:cs="Calibri" w:eastAsia="Calibri" w:hAnsi="Calibri"/>
+          <w:i/>
+          <w:iCs/>
+          <w:color w:val="5B5B5B"/>
+          <w:sz w:val="19"/>
+          <w:szCs w:val="19"/>
+        </w:rPr>
+        <w:t xml:space="preserve">  —  Cotas contradictorias o relaciones geométricas por confirmar.</w:t>
+      </w:r>
+    </w:p>
+    <w:p>
+      <w:pPr>
+        <w:spacing w:after="60" w:before="160"/>
+      </w:pPr>
+      <w:r>
+        <w:drawing>
+          <wp:inline distT="0" distB="0" distL="0" distR="0">
+            <wp:extent cx="5524500" cy="2752725"/>
+            <wp:effectExtent t="0" r="0" b="0" l="0"/>
+            <wp:docPr id="1" name="" descr="" title=""/>
+            <wp:cNvGraphicFramePr>
+              <a:graphicFrameLocks xmlns:a="http://schemas.openxmlformats.org/drawingml/2006/main" noChangeAspect="1"/>
+            </wp:cNvGraphicFramePr>
+            <a:graphic xmlns:a="http://schemas.openxmlformats.org/drawingml/2006/main">
+              <a:graphicData uri="http://schemas.openxmlformats.org/drawingml/2006/picture">
+                <pic:pic xmlns:pic="http://schemas.openxmlformats.org/drawingml/2006/picture">
+                  <pic:nvPicPr>
+                    <pic:cNvPr id="0" name="" descr=""/>
+                    <pic:cNvPicPr>
+                      <a:picLocks noChangeAspect="1" noChangeArrowheads="1"/>
+                    </pic:cNvPicPr>
+                  </pic:nvPicPr>
+                  <pic:blipFill>
+                    <a:blip r:embed="rId15" cstate="none"/>
+                    <a:srcRect/>
+                    <a:stretch>
+                      <a:fillRect/>
+                    </a:stretch>
+                  </pic:blipFill>
+                  <pic:spPr bwMode="auto">
+                    <a:xfrm>
+                      <a:off x="0" y="0"/>
                       <a:ext cx="5524500" cy="2752725"/>
                     </a:xfrm>
                     <a:prstGeom prst="rect">
@@ -9575,7 +9621,7 @@
           <w:rFonts w:ascii="Calibri" w:cs="Calibri" w:eastAsia="Calibri" w:hAnsi="Calibri"/>
           <w:b/>
           <w:bCs/>
-          <w:color w:val="001F54"/>
+          <w:color w:val="002D55"/>
           <w:sz w:val="19"/>
           <w:szCs w:val="19"/>
         </w:rPr>
@@ -9763,7 +9809,7 @@
         <w:rFonts w:ascii="Calibri" w:cs="Calibri" w:eastAsia="Calibri" w:hAnsi="Calibri"/>
         <w:b/>
         <w:bCs/>
-        <w:color w:val="00338D"/>
+        <w:color w:val="00529B"/>
         <w:sz w:val="16"/>
         <w:szCs w:val="16"/>
       </w:rPr>

</xml_diff>